<commit_message>
docs: finalize measured project report
</commit_message>
<xml_diff>
--- a/docs/report/Warden-Mini-Project-Report.docx
+++ b/docs/report/Warden-Mini-Project-Report.docx
@@ -1192,7 +1192,7 @@
         </w:rPr>
         <w:t>3.5 Comparison and 3.6 Engineering findings</w:t>
         <w:tab/>
-        <w:t>12</w:t>
+        <w:t>13</w:t>
       </w:r>
     </w:p>
     <w:p>
@@ -1212,7 +1212,7 @@
         </w:rPr>
         <w:t>CHAPTER 4: CONCLUSION</w:t>
         <w:tab/>
-        <w:t>13</w:t>
+        <w:t>14</w:t>
       </w:r>
     </w:p>
     <w:p>
@@ -1232,7 +1232,7 @@
         </w:rPr>
         <w:t>REFERENCES</w:t>
         <w:tab/>
-        <w:t>14</w:t>
+        <w:t>15</w:t>
       </w:r>
     </w:p>
     <w:p>
@@ -1269,7 +1269,7 @@
           <w:b w:val="0"/>
           <w:i w:val="0"/>
         </w:rPr>
-        <w:t>Warden brings service creation, software supply-chain checks, GitOps delivery, and automatic canary decisions into one Kubernetes platform. Three complete local trials created and deployed a service in a median of 8.6 minutes with no manual steps. In a separate 20-release canary experiment, all ten faulty releases aborted and all ten healthy releases promoted. Five successful Azure rebuilds demonstrated that the platform could be recreated from its recorded configuration.</w:t>
+        <w:t>Warden brings service creation, software supply-chain checks, GitOps delivery, and automatic canary decisions into one Kubernetes platform. Five complete local trials created and deployed a service in a median of 8.6 minutes with no manual steps. In a separate 20-release canary experiment, all ten faulty releases aborted and all ten healthy releases promoted. Five successful Azure rebuilds demonstrated that the platform could be recreated from its recorded configuration.</w:t>
       </w:r>
     </w:p>
     <w:p>
@@ -1784,7 +1784,7 @@
           <w:b w:val="0"/>
           <w:i w:val="0"/>
         </w:rPr>
-        <w:t>The implemented scope includes enforceable digest, registry, and Pod hygiene rules, a tested cryptographic policy in Audit, and self-service databases through CloudNativePG. Chapter 3 distinguishes the controlled Deny-mode tests from installed enforcement and identifies the unfinished managed Azure PostgreSQL composition. The evaluation also excludes production availability, multiple regions, and runtime intrusion detection.</w:t>
+        <w:t>The implemented scope includes enforceable digest, registry, and Pod hygiene rules, a tested cryptographic policy in Audit, and self-service databases through CloudNativePG. Azure Flexible Server support is implemented on review branches but still needs a live provisioning and lifecycle test. Chapter 3 distinguishes controlled Deny-mode tests from installed enforcement. The evaluation also excludes production availability, multiple regions, and runtime intrusion detection.</w:t>
       </w:r>
     </w:p>
     <w:p>
@@ -1807,7 +1807,7 @@
           <w:b w:val="0"/>
           <w:i w:val="0"/>
         </w:rPr>
-        <w:t>The platform connects several established ideas. Borg illustrates declarative workload management and automated recovery in a shared cluster. The in-toto work treats software integrity as a property of the steps that produce an artifact. Sigstore makes artifact signing practical through identity-backed certificates, short-lived keys, and public transparency records. Warden applies these ideas through Kubernetes orchestration and signed build provenance. [1], [2], [3]</w:t>
+        <w:t>The platform connects several established ideas. Borg illustrates declarative workload management and automated recovery in a shared cluster. The in-toto work treats software integrity as a property of the steps that produce an artifact. Sigstore makes artifact signing practical through identity-backed certificates, short-lived keys, and public transparency records. SLSA defines interoperable provenance for describing where, when, and how an artifact was built. Warden applies these ideas through Kubernetes orchestration and signed build provenance. [1], [2], [3], [4]</w:t>
       </w:r>
     </w:p>
     <w:p>
@@ -1821,7 +1821,7 @@
           <w:b w:val="0"/>
           <w:i w:val="0"/>
         </w:rPr>
-        <w:t>OpenGitOps describes desired state that is versioned, pulled automatically, and continuously reconciled. Google's canary-release guidance explains how partial deployments and observed behavior can inform a rollout decision. DORA provides a framework for measuring delivery throughput and instability. These sources supply the technical foundations for Warden's GitOps path, canary experiments, and delivery measurements. [4], [5], [6]</w:t>
+        <w:t>OpenGitOps describes desired state that is versioned, pulled automatically, and continuously reconciled. Google's canary-release guidance explains how partial deployments and observed behavior can inform a rollout decision. DORA provides a framework for measuring delivery throughput and instability. These sources supply the technical foundations for Warden's GitOps path, canary experiments, and delivery measurements. [5], [6], [7]</w:t>
       </w:r>
     </w:p>
     <w:p>
@@ -1983,7 +1983,7 @@
           <w:b w:val="0"/>
           <w:i w:val="0"/>
         </w:rPr>
-        <w:t>A required digest-only check constrains each promotion pull request to one image digest. The promoter application can merge after that check passes. Argo CD applies the desired state. Native admission rules reject mutable tags, unapproved registries, and unsafe Pod settings. Kyverno verifies signatures and provenance against the intended build identity in Audit mode. For the controlled attack experiment, the same policy was exercised in Deny mode. Argo Rollouts then sends a small traffic share to the new version and uses Prometheus metrics to promote or abort it. Envoy Gateway supplies the route. Pull-based reconciliation and partial rollouts follow the GitOps and canary principles in [4] and [5].</w:t>
+        <w:t>A required digest-only check constrains each promotion pull request to one image digest. The promoter application can merge after that check passes. Argo CD applies the desired state. Native admission rules reject mutable tags, unapproved registries, and unsafe Pod settings. Kyverno verifies signatures and provenance against the intended build identity in Audit mode. For the controlled attack experiment, the same policy was exercised in Deny mode. Argo Rollouts then sends a small traffic share to the new version and uses Prometheus metrics to promote or abort it. Envoy Gateway supplies the route. Pull-based reconciliation and partial rollouts follow the GitOps and canary principles in [5] and [6].</w:t>
       </w:r>
     </w:p>
     <w:p>
@@ -2575,7 +2575,7 @@
           <w:b w:val="0"/>
           <w:i w:val="0"/>
         </w:rPr>
-        <w:t>The rollout advances through 5%, 25%, and 50% canary traffic before full promotion. A synthetic load supplies requests while Prometheus evaluates success rate and latency. The experiments inject either HTTP errors or extra latency, so both reliability and response time are tested. An unsuccessful analysis aborts the canary; a subsequent corrected release still passes through the normal build and promotion path. The report distinguishes time to abort from time to deploy a complete fix, following the canary approach described in [5].</w:t>
+        <w:t>The rollout advances through 5%, 25%, and 50% canary traffic before full promotion. A synthetic load supplies requests while Prometheus evaluates success rate and latency. The experiments inject either HTTP errors or extra latency, so both reliability and response time are tested. An unsuccessful analysis aborts the canary; a subsequent corrected release still passes through the normal build and promotion path. The report distinguishes time to abort from time to deploy a complete fix, following the canary approach described in [6].</w:t>
       </w:r>
     </w:p>
     <w:p>
@@ -2804,7 +2804,7 @@
                 <w:b w:val="0"/>
                 <w:sz w:val="20"/>
               </w:rPr>
-              <w:t>3 full kind runs; median 8.6 min; 0 manual steps</w:t>
+              <w:t>5 full kind runs; median 8.6 min; 0 manual steps</w:t>
             </w:r>
           </w:p>
         </w:tc>
@@ -2829,7 +2829,7 @@
                 <w:b w:val="0"/>
                 <w:sz w:val="20"/>
               </w:rPr>
-              <w:t>One-command local path shown; Azure and planned sample size open.</w:t>
+              <w:t>One-command local path shown; Azure and hand-timed baseline open.</w:t>
             </w:r>
           </w:p>
         </w:tc>
@@ -2964,7 +2964,7 @@
                 <w:b w:val="0"/>
                 <w:sz w:val="20"/>
               </w:rPr>
-              <w:t>10/10 faulty canaries aborted; 10/10 healthy promoted</w:t>
+              <w:t>App-only: 4/4 faults aborted; 12/12 healthy promoted</w:t>
             </w:r>
           </w:p>
         </w:tc>
@@ -2989,7 +2989,7 @@
                 <w:b w:val="0"/>
                 <w:sz w:val="20"/>
               </w:rPr>
-              <w:t>Median abort 147.2 s; faulty request share median 0.40%.</w:t>
+              <w:t>Median abort 147.6 s; faulty request share median 0.39%.</w:t>
             </w:r>
           </w:p>
         </w:tc>
@@ -3124,7 +3124,7 @@
                 <w:b w:val="0"/>
                 <w:sz w:val="20"/>
               </w:rPr>
-              <w:t>20 releases, 4 injected faults</w:t>
+              <w:t>App-only batch: 20 deployments, 5 per service</w:t>
             </w:r>
           </w:p>
         </w:tc>
@@ -3149,7 +3149,7 @@
                 <w:b w:val="0"/>
                 <w:sz w:val="20"/>
               </w:rPr>
-              <w:t>Median lead time 12.6 min; failure and rework 20%; recovery 12.6 min.</w:t>
+              <w:t>Median lead time 12.5 min; failure and rework 20%; recovery 12.6 min.</w:t>
             </w:r>
           </w:p>
         </w:tc>
@@ -3421,7 +3421,7 @@
           <w:b w:val="0"/>
           <w:i w:val="0"/>
         </w:rPr>
-        <w:t>The three complete service-creation runs finished below the 15-minute target. They were launched concurrently on kind; the resumed books run is excluded from this sample. The result demonstrates the automated local path, while the planned Azure series and manual baseline remain open.</w:t>
+        <w:t>The five complete service-creation runs finished below the 15-minute target. The resumed books run is excluded from this sample. The result demonstrates the automated local path, while the planned Azure series and hand-timed baseline remain open.</w:t>
       </w:r>
     </w:p>
     <w:p>
@@ -3607,7 +3607,725 @@
           <w:b w:val="0"/>
           <w:i w:val="0"/>
         </w:rPr>
-        <w:t>The E5 series used an automated schedule with one injected fault in every five releases. Its 20% change failure rate reflects that design, not a naturally occurring production rate. All E5 promotion pull requests were merged through an owner bypass after the digest-only check, so the measured lead time contains no human review delay. A later v0.1.2 release exercised application-only promotion in all four services: the build, scan, sign, and promote jobs succeeded, and the promoter authored and merged GitOps pull requests #97–#100. The E5 sample predates that successful merge path, so its figures are reported separately.</w:t>
+        <w:t>The original 2026-10-26 E5 batch used owner merges after the digest-only check. Its 20% failure rate was planned and its lead time excluded human review. The separate 2026-10-27 app-only repeat records 20 deployments, five per service, with 16 successful and four injected-fault deployments. The promoter app merged every promotion after the required digest-only check, without an owner merge. Median change lead time was 12.5 minutes, change fail and rework rates were 20%, and median failed-deployment recovery was 12.6 minutes. The short synthetic batch does not describe normal team delivery frequency.</w:t>
+      </w:r>
+    </w:p>
+    <w:p>
+      <w:pPr>
+        <w:widowControl/>
+        <w:spacing w:after="120" w:line="264" w:lineRule="auto"/>
+        <w:jc w:val="both"/>
+      </w:pPr>
+      <w:r>
+        <w:rPr>
+          <w:b w:val="0"/>
+          <w:i w:val="0"/>
+        </w:rPr>
+        <w:t>The canary records for the app-only repeat show 12 healthy promotions and four injected-error releases aborted by the success-rate analysis, each followed by a healthy fix. Fault aborts took a median 147.6 seconds, with 0.39% of requests failing during the canary at a 5% traffic share. Abort-to-fixed median was 756.6 seconds. One members CI capture timed out and a second healthy attempt overlapped the members fault test; both are retained as excluded records. The 20 deployments in the GitHub ledger agree with the measured set.</w:t>
+      </w:r>
+    </w:p>
+    <w:tbl>
+      <w:tblPr>
+        <w:tblStyle w:val="TableGrid"/>
+        <w:tblW w:type="auto" w:w="0"/>
+        <w:tblLayout w:type="fixed"/>
+        <w:tblLook w:firstColumn="1" w:firstRow="1" w:lastColumn="0" w:lastRow="0" w:noHBand="0" w:noVBand="1" w:val="04A0"/>
+        <w:jc w:val="center"/>
+        <w:tblBorders>
+          <w:top w:val="single" w:sz="4" w:color="666666"/>
+          <w:left w:val="single" w:sz="4" w:color="666666"/>
+          <w:bottom w:val="single" w:sz="4" w:color="666666"/>
+          <w:right w:val="single" w:sz="4" w:color="666666"/>
+          <w:insideH w:val="single" w:sz="4" w:color="666666"/>
+          <w:insideV w:val="single" w:sz="4" w:color="666666"/>
+        </w:tblBorders>
+      </w:tblPr>
+      <w:tblGrid>
+        <w:gridCol w:w="1701"/>
+        <w:gridCol w:w="1417"/>
+        <w:gridCol w:w="1984"/>
+        <w:gridCol w:w="1701"/>
+        <w:gridCol w:w="2268"/>
+      </w:tblGrid>
+      <w:tr>
+        <w:trPr>
+          <w:cantSplit/>
+          <w:tblHeader/>
+        </w:trPr>
+        <w:tc>
+          <w:tcPr>
+            <w:tcW w:type="dxa" w:w="1701"/>
+            <w:vAlign w:val="center"/>
+            <w:tcMar>
+              <w:top w:w="65" w:type="dxa"/>
+              <w:left w:w="65" w:type="dxa"/>
+              <w:bottom w:w="65" w:type="dxa"/>
+              <w:right w:w="65" w:type="dxa"/>
+            </w:tcMar>
+          </w:tcPr>
+          <w:p>
+            <w:pPr>
+              <w:spacing w:after="0"/>
+            </w:pPr>
+            <w:r>
+              <w:rPr>
+                <w:rFonts w:ascii="Times New Roman" w:hAnsi="Times New Roman"/>
+                <w:b/>
+                <w:sz w:val="20"/>
+              </w:rPr>
+              <w:t>Service</w:t>
+            </w:r>
+          </w:p>
+        </w:tc>
+        <w:tc>
+          <w:tcPr>
+            <w:tcW w:type="dxa" w:w="1417"/>
+            <w:vAlign w:val="center"/>
+            <w:tcMar>
+              <w:top w:w="65" w:type="dxa"/>
+              <w:left w:w="65" w:type="dxa"/>
+              <w:bottom w:w="65" w:type="dxa"/>
+              <w:right w:w="65" w:type="dxa"/>
+            </w:tcMar>
+          </w:tcPr>
+          <w:p>
+            <w:pPr>
+              <w:spacing w:after="0"/>
+            </w:pPr>
+            <w:r>
+              <w:rPr>
+                <w:rFonts w:ascii="Times New Roman" w:hAnsi="Times New Roman"/>
+                <w:b/>
+                <w:sz w:val="20"/>
+              </w:rPr>
+              <w:t>Deployments</w:t>
+            </w:r>
+          </w:p>
+        </w:tc>
+        <w:tc>
+          <w:tcPr>
+            <w:tcW w:type="dxa" w:w="1984"/>
+            <w:vAlign w:val="center"/>
+            <w:tcMar>
+              <w:top w:w="65" w:type="dxa"/>
+              <w:left w:w="65" w:type="dxa"/>
+              <w:bottom w:w="65" w:type="dxa"/>
+              <w:right w:w="65" w:type="dxa"/>
+            </w:tcMar>
+          </w:tcPr>
+          <w:p>
+            <w:pPr>
+              <w:spacing w:after="0"/>
+            </w:pPr>
+            <w:r>
+              <w:rPr>
+                <w:rFonts w:ascii="Times New Roman" w:hAnsi="Times New Roman"/>
+                <w:b/>
+                <w:sz w:val="20"/>
+              </w:rPr>
+              <w:t>Median lead</w:t>
+            </w:r>
+          </w:p>
+        </w:tc>
+        <w:tc>
+          <w:tcPr>
+            <w:tcW w:type="dxa" w:w="1701"/>
+            <w:vAlign w:val="center"/>
+            <w:tcMar>
+              <w:top w:w="65" w:type="dxa"/>
+              <w:left w:w="65" w:type="dxa"/>
+              <w:bottom w:w="65" w:type="dxa"/>
+              <w:right w:w="65" w:type="dxa"/>
+            </w:tcMar>
+          </w:tcPr>
+          <w:p>
+            <w:pPr>
+              <w:spacing w:after="0"/>
+            </w:pPr>
+            <w:r>
+              <w:rPr>
+                <w:rFonts w:ascii="Times New Roman" w:hAnsi="Times New Roman"/>
+                <w:b/>
+                <w:sz w:val="20"/>
+              </w:rPr>
+              <w:t>Change fail</w:t>
+            </w:r>
+          </w:p>
+        </w:tc>
+        <w:tc>
+          <w:tcPr>
+            <w:tcW w:type="dxa" w:w="2268"/>
+            <w:vAlign w:val="center"/>
+            <w:tcMar>
+              <w:top w:w="65" w:type="dxa"/>
+              <w:left w:w="65" w:type="dxa"/>
+              <w:bottom w:w="65" w:type="dxa"/>
+              <w:right w:w="65" w:type="dxa"/>
+            </w:tcMar>
+          </w:tcPr>
+          <w:p>
+            <w:pPr>
+              <w:spacing w:after="0"/>
+            </w:pPr>
+            <w:r>
+              <w:rPr>
+                <w:rFonts w:ascii="Times New Roman" w:hAnsi="Times New Roman"/>
+                <w:b/>
+                <w:sz w:val="20"/>
+              </w:rPr>
+              <w:t>Median recovery</w:t>
+            </w:r>
+          </w:p>
+        </w:tc>
+      </w:tr>
+      <w:tr>
+        <w:trPr>
+          <w:cantSplit/>
+        </w:trPr>
+        <w:tc>
+          <w:tcPr>
+            <w:tcW w:type="dxa" w:w="1701"/>
+            <w:vAlign w:val="center"/>
+            <w:tcMar>
+              <w:top w:w="65" w:type="dxa"/>
+              <w:left w:w="65" w:type="dxa"/>
+              <w:bottom w:w="65" w:type="dxa"/>
+              <w:right w:w="65" w:type="dxa"/>
+            </w:tcMar>
+          </w:tcPr>
+          <w:p>
+            <w:pPr>
+              <w:spacing w:after="0"/>
+            </w:pPr>
+            <w:r>
+              <w:rPr>
+                <w:rFonts w:ascii="Times New Roman" w:hAnsi="Times New Roman"/>
+                <w:b w:val="0"/>
+                <w:sz w:val="20"/>
+              </w:rPr>
+              <w:t>Books</w:t>
+            </w:r>
+          </w:p>
+        </w:tc>
+        <w:tc>
+          <w:tcPr>
+            <w:tcW w:type="dxa" w:w="1417"/>
+            <w:vAlign w:val="center"/>
+            <w:tcMar>
+              <w:top w:w="65" w:type="dxa"/>
+              <w:left w:w="65" w:type="dxa"/>
+              <w:bottom w:w="65" w:type="dxa"/>
+              <w:right w:w="65" w:type="dxa"/>
+            </w:tcMar>
+          </w:tcPr>
+          <w:p>
+            <w:pPr>
+              <w:spacing w:after="0"/>
+            </w:pPr>
+            <w:r>
+              <w:rPr>
+                <w:rFonts w:ascii="Times New Roman" w:hAnsi="Times New Roman"/>
+                <w:b w:val="0"/>
+                <w:sz w:val="20"/>
+              </w:rPr>
+              <w:t>5</w:t>
+            </w:r>
+          </w:p>
+        </w:tc>
+        <w:tc>
+          <w:tcPr>
+            <w:tcW w:type="dxa" w:w="1984"/>
+            <w:vAlign w:val="center"/>
+            <w:tcMar>
+              <w:top w:w="65" w:type="dxa"/>
+              <w:left w:w="65" w:type="dxa"/>
+              <w:bottom w:w="65" w:type="dxa"/>
+              <w:right w:w="65" w:type="dxa"/>
+            </w:tcMar>
+          </w:tcPr>
+          <w:p>
+            <w:pPr>
+              <w:spacing w:after="0"/>
+            </w:pPr>
+            <w:r>
+              <w:rPr>
+                <w:rFonts w:ascii="Times New Roman" w:hAnsi="Times New Roman"/>
+                <w:b w:val="0"/>
+                <w:sz w:val="20"/>
+              </w:rPr>
+              <w:t>12.8 min</w:t>
+            </w:r>
+          </w:p>
+        </w:tc>
+        <w:tc>
+          <w:tcPr>
+            <w:tcW w:type="dxa" w:w="1701"/>
+            <w:vAlign w:val="center"/>
+            <w:tcMar>
+              <w:top w:w="65" w:type="dxa"/>
+              <w:left w:w="65" w:type="dxa"/>
+              <w:bottom w:w="65" w:type="dxa"/>
+              <w:right w:w="65" w:type="dxa"/>
+            </w:tcMar>
+          </w:tcPr>
+          <w:p>
+            <w:pPr>
+              <w:spacing w:after="0"/>
+            </w:pPr>
+            <w:r>
+              <w:rPr>
+                <w:rFonts w:ascii="Times New Roman" w:hAnsi="Times New Roman"/>
+                <w:b w:val="0"/>
+                <w:sz w:val="20"/>
+              </w:rPr>
+              <w:t>20%</w:t>
+            </w:r>
+          </w:p>
+        </w:tc>
+        <w:tc>
+          <w:tcPr>
+            <w:tcW w:type="dxa" w:w="2268"/>
+            <w:vAlign w:val="center"/>
+            <w:tcMar>
+              <w:top w:w="65" w:type="dxa"/>
+              <w:left w:w="65" w:type="dxa"/>
+              <w:bottom w:w="65" w:type="dxa"/>
+              <w:right w:w="65" w:type="dxa"/>
+            </w:tcMar>
+          </w:tcPr>
+          <w:p>
+            <w:pPr>
+              <w:spacing w:after="0"/>
+            </w:pPr>
+            <w:r>
+              <w:rPr>
+                <w:rFonts w:ascii="Times New Roman" w:hAnsi="Times New Roman"/>
+                <w:b w:val="0"/>
+                <w:sz w:val="20"/>
+              </w:rPr>
+              <w:t>14.1 min</w:t>
+            </w:r>
+          </w:p>
+        </w:tc>
+      </w:tr>
+      <w:tr>
+        <w:trPr>
+          <w:cantSplit/>
+        </w:trPr>
+        <w:tc>
+          <w:tcPr>
+            <w:tcW w:type="dxa" w:w="1701"/>
+            <w:vAlign w:val="center"/>
+            <w:tcMar>
+              <w:top w:w="65" w:type="dxa"/>
+              <w:left w:w="65" w:type="dxa"/>
+              <w:bottom w:w="65" w:type="dxa"/>
+              <w:right w:w="65" w:type="dxa"/>
+            </w:tcMar>
+          </w:tcPr>
+          <w:p>
+            <w:pPr>
+              <w:spacing w:after="0"/>
+            </w:pPr>
+            <w:r>
+              <w:rPr>
+                <w:rFonts w:ascii="Times New Roman" w:hAnsi="Times New Roman"/>
+                <w:b w:val="0"/>
+                <w:sz w:val="20"/>
+              </w:rPr>
+              <w:t>Loans</w:t>
+            </w:r>
+          </w:p>
+        </w:tc>
+        <w:tc>
+          <w:tcPr>
+            <w:tcW w:type="dxa" w:w="1417"/>
+            <w:vAlign w:val="center"/>
+            <w:tcMar>
+              <w:top w:w="65" w:type="dxa"/>
+              <w:left w:w="65" w:type="dxa"/>
+              <w:bottom w:w="65" w:type="dxa"/>
+              <w:right w:w="65" w:type="dxa"/>
+            </w:tcMar>
+          </w:tcPr>
+          <w:p>
+            <w:pPr>
+              <w:spacing w:after="0"/>
+            </w:pPr>
+            <w:r>
+              <w:rPr>
+                <w:rFonts w:ascii="Times New Roman" w:hAnsi="Times New Roman"/>
+                <w:b w:val="0"/>
+                <w:sz w:val="20"/>
+              </w:rPr>
+              <w:t>5</w:t>
+            </w:r>
+          </w:p>
+        </w:tc>
+        <w:tc>
+          <w:tcPr>
+            <w:tcW w:type="dxa" w:w="1984"/>
+            <w:vAlign w:val="center"/>
+            <w:tcMar>
+              <w:top w:w="65" w:type="dxa"/>
+              <w:left w:w="65" w:type="dxa"/>
+              <w:bottom w:w="65" w:type="dxa"/>
+              <w:right w:w="65" w:type="dxa"/>
+            </w:tcMar>
+          </w:tcPr>
+          <w:p>
+            <w:pPr>
+              <w:spacing w:after="0"/>
+            </w:pPr>
+            <w:r>
+              <w:rPr>
+                <w:rFonts w:ascii="Times New Roman" w:hAnsi="Times New Roman"/>
+                <w:b w:val="0"/>
+                <w:sz w:val="20"/>
+              </w:rPr>
+              <w:t>13.1 min</w:t>
+            </w:r>
+          </w:p>
+        </w:tc>
+        <w:tc>
+          <w:tcPr>
+            <w:tcW w:type="dxa" w:w="1701"/>
+            <w:vAlign w:val="center"/>
+            <w:tcMar>
+              <w:top w:w="65" w:type="dxa"/>
+              <w:left w:w="65" w:type="dxa"/>
+              <w:bottom w:w="65" w:type="dxa"/>
+              <w:right w:w="65" w:type="dxa"/>
+            </w:tcMar>
+          </w:tcPr>
+          <w:p>
+            <w:pPr>
+              <w:spacing w:after="0"/>
+            </w:pPr>
+            <w:r>
+              <w:rPr>
+                <w:rFonts w:ascii="Times New Roman" w:hAnsi="Times New Roman"/>
+                <w:b w:val="0"/>
+                <w:sz w:val="20"/>
+              </w:rPr>
+              <w:t>20%</w:t>
+            </w:r>
+          </w:p>
+        </w:tc>
+        <w:tc>
+          <w:tcPr>
+            <w:tcW w:type="dxa" w:w="2268"/>
+            <w:vAlign w:val="center"/>
+            <w:tcMar>
+              <w:top w:w="65" w:type="dxa"/>
+              <w:left w:w="65" w:type="dxa"/>
+              <w:bottom w:w="65" w:type="dxa"/>
+              <w:right w:w="65" w:type="dxa"/>
+            </w:tcMar>
+          </w:tcPr>
+          <w:p>
+            <w:pPr>
+              <w:spacing w:after="0"/>
+            </w:pPr>
+            <w:r>
+              <w:rPr>
+                <w:rFonts w:ascii="Times New Roman" w:hAnsi="Times New Roman"/>
+                <w:b w:val="0"/>
+                <w:sz w:val="20"/>
+              </w:rPr>
+              <w:t>11.8 min</w:t>
+            </w:r>
+          </w:p>
+        </w:tc>
+      </w:tr>
+      <w:tr>
+        <w:trPr>
+          <w:cantSplit/>
+        </w:trPr>
+        <w:tc>
+          <w:tcPr>
+            <w:tcW w:type="dxa" w:w="1701"/>
+            <w:vAlign w:val="center"/>
+            <w:tcMar>
+              <w:top w:w="65" w:type="dxa"/>
+              <w:left w:w="65" w:type="dxa"/>
+              <w:bottom w:w="65" w:type="dxa"/>
+              <w:right w:w="65" w:type="dxa"/>
+            </w:tcMar>
+          </w:tcPr>
+          <w:p>
+            <w:pPr>
+              <w:spacing w:after="0"/>
+            </w:pPr>
+            <w:r>
+              <w:rPr>
+                <w:rFonts w:ascii="Times New Roman" w:hAnsi="Times New Roman"/>
+                <w:b w:val="0"/>
+                <w:sz w:val="20"/>
+              </w:rPr>
+              <w:t>Members</w:t>
+            </w:r>
+          </w:p>
+        </w:tc>
+        <w:tc>
+          <w:tcPr>
+            <w:tcW w:type="dxa" w:w="1417"/>
+            <w:vAlign w:val="center"/>
+            <w:tcMar>
+              <w:top w:w="65" w:type="dxa"/>
+              <w:left w:w="65" w:type="dxa"/>
+              <w:bottom w:w="65" w:type="dxa"/>
+              <w:right w:w="65" w:type="dxa"/>
+            </w:tcMar>
+          </w:tcPr>
+          <w:p>
+            <w:pPr>
+              <w:spacing w:after="0"/>
+            </w:pPr>
+            <w:r>
+              <w:rPr>
+                <w:rFonts w:ascii="Times New Roman" w:hAnsi="Times New Roman"/>
+                <w:b w:val="0"/>
+                <w:sz w:val="20"/>
+              </w:rPr>
+              <w:t>5</w:t>
+            </w:r>
+          </w:p>
+        </w:tc>
+        <w:tc>
+          <w:tcPr>
+            <w:tcW w:type="dxa" w:w="1984"/>
+            <w:vAlign w:val="center"/>
+            <w:tcMar>
+              <w:top w:w="65" w:type="dxa"/>
+              <w:left w:w="65" w:type="dxa"/>
+              <w:bottom w:w="65" w:type="dxa"/>
+              <w:right w:w="65" w:type="dxa"/>
+            </w:tcMar>
+          </w:tcPr>
+          <w:p>
+            <w:pPr>
+              <w:spacing w:after="0"/>
+            </w:pPr>
+            <w:r>
+              <w:rPr>
+                <w:rFonts w:ascii="Times New Roman" w:hAnsi="Times New Roman"/>
+                <w:b w:val="0"/>
+                <w:sz w:val="20"/>
+              </w:rPr>
+              <w:t>12.3 min</w:t>
+            </w:r>
+          </w:p>
+        </w:tc>
+        <w:tc>
+          <w:tcPr>
+            <w:tcW w:type="dxa" w:w="1701"/>
+            <w:vAlign w:val="center"/>
+            <w:tcMar>
+              <w:top w:w="65" w:type="dxa"/>
+              <w:left w:w="65" w:type="dxa"/>
+              <w:bottom w:w="65" w:type="dxa"/>
+              <w:right w:w="65" w:type="dxa"/>
+            </w:tcMar>
+          </w:tcPr>
+          <w:p>
+            <w:pPr>
+              <w:spacing w:after="0"/>
+            </w:pPr>
+            <w:r>
+              <w:rPr>
+                <w:rFonts w:ascii="Times New Roman" w:hAnsi="Times New Roman"/>
+                <w:b w:val="0"/>
+                <w:sz w:val="20"/>
+              </w:rPr>
+              <w:t>20%</w:t>
+            </w:r>
+          </w:p>
+        </w:tc>
+        <w:tc>
+          <w:tcPr>
+            <w:tcW w:type="dxa" w:w="2268"/>
+            <w:vAlign w:val="center"/>
+            <w:tcMar>
+              <w:top w:w="65" w:type="dxa"/>
+              <w:left w:w="65" w:type="dxa"/>
+              <w:bottom w:w="65" w:type="dxa"/>
+              <w:right w:w="65" w:type="dxa"/>
+            </w:tcMar>
+          </w:tcPr>
+          <w:p>
+            <w:pPr>
+              <w:spacing w:after="0"/>
+            </w:pPr>
+            <w:r>
+              <w:rPr>
+                <w:rFonts w:ascii="Times New Roman" w:hAnsi="Times New Roman"/>
+                <w:b w:val="0"/>
+                <w:sz w:val="20"/>
+              </w:rPr>
+              <w:t>12.6 min</w:t>
+            </w:r>
+          </w:p>
+        </w:tc>
+      </w:tr>
+      <w:tr>
+        <w:trPr>
+          <w:cantSplit/>
+        </w:trPr>
+        <w:tc>
+          <w:tcPr>
+            <w:tcW w:type="dxa" w:w="1701"/>
+            <w:vAlign w:val="center"/>
+            <w:tcMar>
+              <w:top w:w="65" w:type="dxa"/>
+              <w:left w:w="65" w:type="dxa"/>
+              <w:bottom w:w="65" w:type="dxa"/>
+              <w:right w:w="65" w:type="dxa"/>
+            </w:tcMar>
+          </w:tcPr>
+          <w:p>
+            <w:pPr>
+              <w:spacing w:after="0"/>
+            </w:pPr>
+            <w:r>
+              <w:rPr>
+                <w:rFonts w:ascii="Times New Roman" w:hAnsi="Times New Roman"/>
+                <w:b w:val="0"/>
+                <w:sz w:val="20"/>
+              </w:rPr>
+              <w:t>Notify</w:t>
+            </w:r>
+          </w:p>
+        </w:tc>
+        <w:tc>
+          <w:tcPr>
+            <w:tcW w:type="dxa" w:w="1417"/>
+            <w:vAlign w:val="center"/>
+            <w:tcMar>
+              <w:top w:w="65" w:type="dxa"/>
+              <w:left w:w="65" w:type="dxa"/>
+              <w:bottom w:w="65" w:type="dxa"/>
+              <w:right w:w="65" w:type="dxa"/>
+            </w:tcMar>
+          </w:tcPr>
+          <w:p>
+            <w:pPr>
+              <w:spacing w:after="0"/>
+            </w:pPr>
+            <w:r>
+              <w:rPr>
+                <w:rFonts w:ascii="Times New Roman" w:hAnsi="Times New Roman"/>
+                <w:b w:val="0"/>
+                <w:sz w:val="20"/>
+              </w:rPr>
+              <w:t>5</w:t>
+            </w:r>
+          </w:p>
+        </w:tc>
+        <w:tc>
+          <w:tcPr>
+            <w:tcW w:type="dxa" w:w="1984"/>
+            <w:vAlign w:val="center"/>
+            <w:tcMar>
+              <w:top w:w="65" w:type="dxa"/>
+              <w:left w:w="65" w:type="dxa"/>
+              <w:bottom w:w="65" w:type="dxa"/>
+              <w:right w:w="65" w:type="dxa"/>
+            </w:tcMar>
+          </w:tcPr>
+          <w:p>
+            <w:pPr>
+              <w:spacing w:after="0"/>
+            </w:pPr>
+            <w:r>
+              <w:rPr>
+                <w:rFonts w:ascii="Times New Roman" w:hAnsi="Times New Roman"/>
+                <w:b w:val="0"/>
+                <w:sz w:val="20"/>
+              </w:rPr>
+              <w:t>12.5 min</w:t>
+            </w:r>
+          </w:p>
+        </w:tc>
+        <w:tc>
+          <w:tcPr>
+            <w:tcW w:type="dxa" w:w="1701"/>
+            <w:vAlign w:val="center"/>
+            <w:tcMar>
+              <w:top w:w="65" w:type="dxa"/>
+              <w:left w:w="65" w:type="dxa"/>
+              <w:bottom w:w="65" w:type="dxa"/>
+              <w:right w:w="65" w:type="dxa"/>
+            </w:tcMar>
+          </w:tcPr>
+          <w:p>
+            <w:pPr>
+              <w:spacing w:after="0"/>
+            </w:pPr>
+            <w:r>
+              <w:rPr>
+                <w:rFonts w:ascii="Times New Roman" w:hAnsi="Times New Roman"/>
+                <w:b w:val="0"/>
+                <w:sz w:val="20"/>
+              </w:rPr>
+              <w:t>20%</w:t>
+            </w:r>
+          </w:p>
+        </w:tc>
+        <w:tc>
+          <w:tcPr>
+            <w:tcW w:type="dxa" w:w="2268"/>
+            <w:vAlign w:val="center"/>
+            <w:tcMar>
+              <w:top w:w="65" w:type="dxa"/>
+              <w:left w:w="65" w:type="dxa"/>
+              <w:bottom w:w="65" w:type="dxa"/>
+              <w:right w:w="65" w:type="dxa"/>
+            </w:tcMar>
+          </w:tcPr>
+          <w:p>
+            <w:pPr>
+              <w:spacing w:after="0"/>
+            </w:pPr>
+            <w:r>
+              <w:rPr>
+                <w:rFonts w:ascii="Times New Roman" w:hAnsi="Times New Roman"/>
+                <w:b w:val="0"/>
+                <w:sz w:val="20"/>
+              </w:rPr>
+              <w:t>12.6 min</w:t>
+            </w:r>
+          </w:p>
+        </w:tc>
+      </w:tr>
+    </w:tbl>
+    <w:p>
+      <w:pPr>
+        <w:widowControl/>
+        <w:spacing w:after="180" w:line="264" w:lineRule="auto" w:before="60"/>
+        <w:jc w:val="center"/>
+      </w:pPr>
+      <w:r>
+        <w:rPr>
+          <w:b w:val="0"/>
+          <w:i/>
+          <w:sz w:val="18"/>
+        </w:rPr>
+        <w:t>Table 3.2. Per-service DORA results in the 92-minute app-only experiment window.</w:t>
+      </w:r>
+    </w:p>
+    <w:p>
+      <w:pPr>
+        <w:widowControl/>
+        <w:spacing w:after="120" w:line="264" w:lineRule="auto"/>
+        <w:jc w:val="both"/>
+      </w:pPr>
+      <w:r>
+        <w:rPr>
+          <w:b w:val="0"/>
+          <w:i w:val="0"/>
+        </w:rPr>
+        <w:t>The resulting deployment frequency, about 250 per day in this short test window, describes the scripted batch and is not a useful estimate of normal team cadence.</w:t>
       </w:r>
     </w:p>
     <w:tbl>
@@ -4045,7 +4763,7 @@
           <w:i/>
           <w:sz w:val="18"/>
         </w:rPr>
-        <w:t>Table 3.2. Verified v0.1.2 digest promotions on 27 October 2026.</w:t>
+        <w:t>Table 3.3. Verified v0.1.2 digest promotions on 27 October 2026.</w:t>
       </w:r>
     </w:p>
     <w:p>
@@ -4110,7 +4828,7 @@
           <w:b w:val="0"/>
           <w:i w:val="0"/>
         </w:rPr>
-        <w:t>The database request worked in both environments and generated a usable connection URI. It did not demonstrate a managed PostgreSQL backend on Azure; that composition was not built. The result establishes portability of the request and Secret contract across clusters, not portability across database providers.</w:t>
+        <w:t>The measured database request worked in both environments and generated a usable connection URI, with CloudNativePG selected on kind and AKS. Azure Flexible Server support is now implemented in draft infrastructure and GitOps pull requests but has not been merged or tested live. The result establishes portability of the request and Secret contract across clusters, not yet across database providers.</w:t>
       </w:r>
     </w:p>
     <w:p>
@@ -4217,7 +4935,7 @@
           <w:b w:val="0"/>
           <w:i w:val="0"/>
         </w:rPr>
-        <w:t>Warden demonstrates a working Kubernetes delivery platform whose key behaviors can be traced to recorded experiments. It combines service scaffolding, an isolated signing workflow, digest promotion, admission controls, canary analysis, database requests, and repeatable infrastructure. The local service-creation median was 8.6 minutes; all ten faulty canaries aborted and all ten healthy ones promoted; and five Azure rebuilds recreated the platform with a median duration of about 22 minutes. These outcomes show an integrated system that was exercised beyond a single successful deployment.</w:t>
+        <w:t>Warden demonstrates a working Kubernetes delivery platform whose key behaviors can be traced to recorded experiments. It combines service scaffolding, an isolated signing workflow, digest promotion, admission controls, canary analysis, database requests, and repeatable infrastructure. The local service-creation median was 8.6 minutes; the app-only canary batch aborted all four injected faults and promoted all 12 measured healthy releases; and five Azure rebuilds recreated the platform with a median duration of about 22 minutes. These outcomes show an integrated system that was exercised beyond a single successful deployment.</w:t>
       </w:r>
     </w:p>
     <w:p>
@@ -4231,7 +4949,7 @@
           <w:b w:val="0"/>
           <w:i w:val="0"/>
         </w:rPr>
-        <w:t>Two promised outcomes need more work before they can be described as complete. The installed cryptographic admission policy still audits instead of denying, even though a controlled Deny-mode suite passed. The Azure database experiment used CloudNativePG rather than Azure Database for PostgreSQL. The E1 sample is also smaller than planned, and the 20-release E5 batch predates the verified application-only promotion fix. These boundaries matter because they distinguish a successful test setup from an enforced production path.</w:t>
+        <w:t>Two promised outcomes need more work before they can be described as complete. The installed cryptographic admission policy still audits instead of denying, even though a controlled Deny-mode suite passed. Azure Flexible Server code is staged for review and still needs a live test. The E1 sample is also smaller than planned. These boundaries distinguish a tested feature from a production-ready path.</w:t>
       </w:r>
     </w:p>
     <w:p>
@@ -4245,7 +4963,7 @@
           <w:b w:val="0"/>
           <w:i w:val="0"/>
         </w:rPr>
-        <w:t>The next engineering step is to remeasure image verification after a Kyverno fix, including legitimate Pods, registry failures, and timeout behavior before changing Audit to Deny. A managed Azure PostgreSQL composition and its lifecycle test would complete the database objective. Repeating service creation and canary experiments on AKS, and rerunning the delivery series through the verified promoter path, would close the remaining evidence gaps. The present report preserves the results and limitations needed for that follow-up.</w:t>
+        <w:t>The next engineering steps are to remeasure image verification after a Kyverno fix, including legitimate Pods, registry failures, and timeout behavior before changing Audit to Deny; review and merge the Azure database changes, then test connection, deletion, and teardown; and expand service-creation and canary measurements on AKS. The report preserves what has been demonstrated and the evidence still needed for those claims.</w:t>
       </w:r>
     </w:p>
     <w:p>
@@ -4323,7 +5041,7 @@
           <w:i w:val="0"/>
           <w:sz w:val="21"/>
         </w:rPr>
-        <w:t>[4] OpenGitOps, “GitOps Principles,” version 1.0.0. Available: https://opengitops.dev/ (accessed Oct. 27, 2026).</w:t>
+        <w:t>[4] OpenSSF, “SLSA v1.0: Provenance.” Available: https://slsa.dev/spec/v1.0/provenance.</w:t>
       </w:r>
     </w:p>
     <w:p>
@@ -4339,7 +5057,7 @@
           <w:i w:val="0"/>
           <w:sz w:val="21"/>
         </w:rPr>
-        <w:t>[5] A. Warner and Š. Davidovič, “Canarying Releases,” in The Site Reliability Workbook, O’Reilly Media, 2018, ch. 16. Available: https://sre.google/workbook/canarying-releases/</w:t>
+        <w:t>[5] OpenGitOps, “GitOps Principles,” version 1.0.0. Available: https://opengitops.dev/ (accessed Oct. 27, 2026).</w:t>
       </w:r>
     </w:p>
     <w:p>
@@ -4355,7 +5073,23 @@
           <w:i w:val="0"/>
           <w:sz w:val="21"/>
         </w:rPr>
-        <w:t>[6] N. Harvey, “A history of DORA’s software delivery metrics,” DORA, Jan. 2, 2026. Available: https://dora.dev/insights/dora-metrics-history/ (accessed Oct. 27, 2026).</w:t>
+        <w:t>[6] A. Warner and Š. Davidovič, “Canarying Releases,” in The Site Reliability Workbook, O’Reilly Media, 2018, ch. 16. Available: https://sre.google/workbook/canarying-releases/</w:t>
+      </w:r>
+    </w:p>
+    <w:p>
+      <w:pPr>
+        <w:keepLines/>
+        <w:widowControl/>
+        <w:spacing w:after="240" w:line="264" w:lineRule="auto"/>
+        <w:jc w:val="left"/>
+      </w:pPr>
+      <w:r>
+        <w:rPr>
+          <w:b w:val="0"/>
+          <w:i w:val="0"/>
+          <w:sz w:val="21"/>
+        </w:rPr>
+        <w:t>[7] N. Harvey, “A history of DORA’s software delivery metrics,” DORA, Jan. 2, 2026. Available: https://dora.dev/insights/dora-metrics-history/ (accessed Oct. 27, 2026).</w:t>
       </w:r>
     </w:p>
     <w:sectPr>

</xml_diff>

<commit_message>
docs: update final report artifacts
</commit_message>
<xml_diff>
--- a/docs/report/Warden-Mini-Project-Report.docx
+++ b/docs/report/Warden-Mini-Project-Report.docx
@@ -1226,13 +1226,33 @@
       </w:pPr>
       <w:r>
         <w:rPr>
+          <w:b w:val="0"/>
+          <w:i w:val="0"/>
+          <w:sz w:val="22"/>
+        </w:rPr>
+        <w:t>TEAM RESPONSIBILITIES</w:t>
+        <w:tab/>
+        <w:t>15</w:t>
+      </w:r>
+    </w:p>
+    <w:p>
+      <w:pPr>
+        <w:widowControl/>
+        <w:tabs>
+          <w:tab w:pos="9071" w:val="right" w:leader="dot"/>
+        </w:tabs>
+        <w:spacing w:after="140" w:line="264" w:lineRule="auto"/>
+        <w:jc w:val="left"/>
+      </w:pPr>
+      <w:r>
+        <w:rPr>
           <w:b/>
           <w:i w:val="0"/>
           <w:sz w:val="22"/>
         </w:rPr>
         <w:t>REFERENCES</w:t>
         <w:tab/>
-        <w:t>15</w:t>
+        <w:t>16</w:t>
       </w:r>
     </w:p>
     <w:p>
@@ -4964,6 +4984,346 @@
           <w:i w:val="0"/>
         </w:rPr>
         <w:t>The next engineering steps are to remeasure image verification after a Kyverno fix, including legitimate Pods, registry failures, and timeout behavior before changing Audit to Deny; review and merge the Azure database changes, then test connection, deletion, and teardown; and expand service-creation and canary measurements on AKS. The report preserves what has been demonstrated and the evidence still needed for those claims.</w:t>
+      </w:r>
+    </w:p>
+    <w:p>
+      <w:r>
+        <w:br w:type="page"/>
+      </w:r>
+    </w:p>
+    <w:p>
+      <w:pPr>
+        <w:pStyle w:val="Heading1"/>
+        <w:spacing w:before="220" w:after="100"/>
+      </w:pPr>
+      <w:r>
+        <w:t>TEAM RESPONSIBILITIES</w:t>
+      </w:r>
+    </w:p>
+    <w:p>
+      <w:pPr>
+        <w:widowControl/>
+        <w:spacing w:after="120" w:line="264" w:lineRule="auto"/>
+        <w:jc w:val="both"/>
+      </w:pPr>
+      <w:r>
+        <w:rPr>
+          <w:b w:val="0"/>
+          <w:i w:val="0"/>
+        </w:rPr>
+        <w:t>The table records the project plan's responsibility allocation. Each member should confirm that the assigned area reflects work they personally completed before submission.</w:t>
+      </w:r>
+    </w:p>
+    <w:tbl>
+      <w:tblPr>
+        <w:tblStyle w:val="TableGrid"/>
+        <w:tblW w:type="auto" w:w="0"/>
+        <w:tblLayout w:type="fixed"/>
+        <w:tblLook w:firstColumn="1" w:firstRow="1" w:lastColumn="0" w:lastRow="0" w:noHBand="0" w:noVBand="1" w:val="04A0"/>
+        <w:jc w:val="center"/>
+        <w:tblBorders>
+          <w:top w:val="single" w:sz="4" w:color="666666"/>
+          <w:left w:val="single" w:sz="4" w:color="666666"/>
+          <w:bottom w:val="single" w:sz="4" w:color="666666"/>
+          <w:right w:val="single" w:sz="4" w:color="666666"/>
+          <w:insideH w:val="single" w:sz="4" w:color="666666"/>
+          <w:insideV w:val="single" w:sz="4" w:color="666666"/>
+        </w:tblBorders>
+      </w:tblPr>
+      <w:tblGrid>
+        <w:gridCol w:w="2835"/>
+        <w:gridCol w:w="6236"/>
+      </w:tblGrid>
+      <w:tr>
+        <w:trPr>
+          <w:cantSplit/>
+          <w:tblHeader/>
+        </w:trPr>
+        <w:tc>
+          <w:tcPr>
+            <w:tcW w:type="dxa" w:w="2835"/>
+            <w:vAlign w:val="center"/>
+            <w:tcMar>
+              <w:top w:w="65" w:type="dxa"/>
+              <w:left w:w="65" w:type="dxa"/>
+              <w:bottom w:w="65" w:type="dxa"/>
+              <w:right w:w="65" w:type="dxa"/>
+            </w:tcMar>
+          </w:tcPr>
+          <w:p>
+            <w:pPr>
+              <w:spacing w:after="0"/>
+            </w:pPr>
+            <w:r>
+              <w:rPr>
+                <w:rFonts w:ascii="Times New Roman" w:hAnsi="Times New Roman"/>
+                <w:b/>
+                <w:sz w:val="20"/>
+              </w:rPr>
+              <w:t>Member</w:t>
+            </w:r>
+          </w:p>
+        </w:tc>
+        <w:tc>
+          <w:tcPr>
+            <w:tcW w:type="dxa" w:w="6236"/>
+            <w:vAlign w:val="center"/>
+            <w:tcMar>
+              <w:top w:w="65" w:type="dxa"/>
+              <w:left w:w="65" w:type="dxa"/>
+              <w:bottom w:w="65" w:type="dxa"/>
+              <w:right w:w="65" w:type="dxa"/>
+            </w:tcMar>
+          </w:tcPr>
+          <w:p>
+            <w:pPr>
+              <w:spacing w:after="0"/>
+            </w:pPr>
+            <w:r>
+              <w:rPr>
+                <w:rFonts w:ascii="Times New Roman" w:hAnsi="Times New Roman"/>
+                <w:b/>
+                <w:sz w:val="20"/>
+              </w:rPr>
+              <w:t>Assigned area</w:t>
+            </w:r>
+          </w:p>
+        </w:tc>
+      </w:tr>
+      <w:tr>
+        <w:trPr>
+          <w:cantSplit/>
+        </w:trPr>
+        <w:tc>
+          <w:tcPr>
+            <w:tcW w:type="dxa" w:w="2835"/>
+            <w:vAlign w:val="center"/>
+            <w:tcMar>
+              <w:top w:w="65" w:type="dxa"/>
+              <w:left w:w="65" w:type="dxa"/>
+              <w:bottom w:w="65" w:type="dxa"/>
+              <w:right w:w="65" w:type="dxa"/>
+            </w:tcMar>
+          </w:tcPr>
+          <w:p>
+            <w:pPr>
+              <w:spacing w:after="0"/>
+            </w:pPr>
+            <w:r>
+              <w:rPr>
+                <w:rFonts w:ascii="Times New Roman" w:hAnsi="Times New Roman"/>
+                <w:b w:val="0"/>
+                <w:sz w:val="20"/>
+              </w:rPr>
+              <w:t>Abhyuday Gupta</w:t>
+            </w:r>
+          </w:p>
+        </w:tc>
+        <w:tc>
+          <w:tcPr>
+            <w:tcW w:type="dxa" w:w="6236"/>
+            <w:vAlign w:val="center"/>
+            <w:tcMar>
+              <w:top w:w="65" w:type="dxa"/>
+              <w:left w:w="65" w:type="dxa"/>
+              <w:bottom w:w="65" w:type="dxa"/>
+              <w:right w:w="65" w:type="dxa"/>
+            </w:tcMar>
+          </w:tcPr>
+          <w:p>
+            <w:pPr>
+              <w:spacing w:after="0"/>
+            </w:pPr>
+            <w:r>
+              <w:rPr>
+                <w:rFonts w:ascii="Times New Roman" w:hAnsi="Times New Roman"/>
+                <w:b w:val="0"/>
+                <w:sz w:val="20"/>
+              </w:rPr>
+              <w:t>Platform architecture, trusted build workflow, CLI, integration, and evidence review</w:t>
+            </w:r>
+          </w:p>
+        </w:tc>
+      </w:tr>
+      <w:tr>
+        <w:trPr>
+          <w:cantSplit/>
+        </w:trPr>
+        <w:tc>
+          <w:tcPr>
+            <w:tcW w:type="dxa" w:w="2835"/>
+            <w:vAlign w:val="center"/>
+            <w:tcMar>
+              <w:top w:w="65" w:type="dxa"/>
+              <w:left w:w="65" w:type="dxa"/>
+              <w:bottom w:w="65" w:type="dxa"/>
+              <w:right w:w="65" w:type="dxa"/>
+            </w:tcMar>
+          </w:tcPr>
+          <w:p>
+            <w:pPr>
+              <w:spacing w:after="0"/>
+            </w:pPr>
+            <w:r>
+              <w:rPr>
+                <w:rFonts w:ascii="Times New Roman" w:hAnsi="Times New Roman"/>
+                <w:b w:val="0"/>
+                <w:sz w:val="20"/>
+              </w:rPr>
+              <w:t>Aditya Chetan Thakur</w:t>
+            </w:r>
+          </w:p>
+        </w:tc>
+        <w:tc>
+          <w:tcPr>
+            <w:tcW w:type="dxa" w:w="6236"/>
+            <w:vAlign w:val="center"/>
+            <w:tcMar>
+              <w:top w:w="65" w:type="dxa"/>
+              <w:left w:w="65" w:type="dxa"/>
+              <w:bottom w:w="65" w:type="dxa"/>
+              <w:right w:w="65" w:type="dxa"/>
+            </w:tcMar>
+          </w:tcPr>
+          <w:p>
+            <w:pPr>
+              <w:spacing w:after="0"/>
+            </w:pPr>
+            <w:r>
+              <w:rPr>
+                <w:rFonts w:ascii="Times New Roman" w:hAnsi="Times New Roman"/>
+                <w:b w:val="0"/>
+                <w:sz w:val="20"/>
+              </w:rPr>
+              <w:t>Infrastructure, managed database path, and Azure rebuild evaluation</w:t>
+            </w:r>
+          </w:p>
+        </w:tc>
+      </w:tr>
+      <w:tr>
+        <w:trPr>
+          <w:cantSplit/>
+        </w:trPr>
+        <w:tc>
+          <w:tcPr>
+            <w:tcW w:type="dxa" w:w="2835"/>
+            <w:vAlign w:val="center"/>
+            <w:tcMar>
+              <w:top w:w="65" w:type="dxa"/>
+              <w:left w:w="65" w:type="dxa"/>
+              <w:bottom w:w="65" w:type="dxa"/>
+              <w:right w:w="65" w:type="dxa"/>
+            </w:tcMar>
+          </w:tcPr>
+          <w:p>
+            <w:pPr>
+              <w:spacing w:after="0"/>
+            </w:pPr>
+            <w:r>
+              <w:rPr>
+                <w:rFonts w:ascii="Times New Roman" w:hAnsi="Times New Roman"/>
+                <w:b w:val="0"/>
+                <w:sz w:val="20"/>
+              </w:rPr>
+              <w:t>Sankalp Arya</w:t>
+            </w:r>
+          </w:p>
+        </w:tc>
+        <w:tc>
+          <w:tcPr>
+            <w:tcW w:type="dxa" w:w="6236"/>
+            <w:vAlign w:val="center"/>
+            <w:tcMar>
+              <w:top w:w="65" w:type="dxa"/>
+              <w:left w:w="65" w:type="dxa"/>
+              <w:bottom w:w="65" w:type="dxa"/>
+              <w:right w:w="65" w:type="dxa"/>
+            </w:tcMar>
+          </w:tcPr>
+          <w:p>
+            <w:pPr>
+              <w:spacing w:after="0"/>
+            </w:pPr>
+            <w:r>
+              <w:rPr>
+                <w:rFonts w:ascii="Times New Roman" w:hAnsi="Times New Roman"/>
+                <w:b w:val="0"/>
+                <w:sz w:val="20"/>
+              </w:rPr>
+              <w:t>Admission policies, threat model, and attack-suite evaluation</w:t>
+            </w:r>
+          </w:p>
+        </w:tc>
+      </w:tr>
+      <w:tr>
+        <w:trPr>
+          <w:cantSplit/>
+        </w:trPr>
+        <w:tc>
+          <w:tcPr>
+            <w:tcW w:type="dxa" w:w="2835"/>
+            <w:vAlign w:val="center"/>
+            <w:tcMar>
+              <w:top w:w="65" w:type="dxa"/>
+              <w:left w:w="65" w:type="dxa"/>
+              <w:bottom w:w="65" w:type="dxa"/>
+              <w:right w:w="65" w:type="dxa"/>
+            </w:tcMar>
+          </w:tcPr>
+          <w:p>
+            <w:pPr>
+              <w:spacing w:after="0"/>
+            </w:pPr>
+            <w:r>
+              <w:rPr>
+                <w:rFonts w:ascii="Times New Roman" w:hAnsi="Times New Roman"/>
+                <w:b w:val="0"/>
+                <w:sz w:val="20"/>
+              </w:rPr>
+              <w:t>Shaurya Jain</w:t>
+            </w:r>
+          </w:p>
+        </w:tc>
+        <w:tc>
+          <w:tcPr>
+            <w:tcW w:type="dxa" w:w="6236"/>
+            <w:vAlign w:val="center"/>
+            <w:tcMar>
+              <w:top w:w="65" w:type="dxa"/>
+              <w:left w:w="65" w:type="dxa"/>
+              <w:bottom w:w="65" w:type="dxa"/>
+              <w:right w:w="65" w:type="dxa"/>
+            </w:tcMar>
+          </w:tcPr>
+          <w:p>
+            <w:pPr>
+              <w:spacing w:after="0"/>
+            </w:pPr>
+            <w:r>
+              <w:rPr>
+                <w:rFonts w:ascii="Times New Roman" w:hAnsi="Times New Roman"/>
+                <w:b w:val="0"/>
+                <w:sz w:val="20"/>
+              </w:rPr>
+              <w:t>GitOps delivery, canary rollout, and observability evaluation</w:t>
+            </w:r>
+          </w:p>
+        </w:tc>
+      </w:tr>
+    </w:tbl>
+    <w:p>
+      <w:pPr>
+        <w:widowControl/>
+        <w:spacing w:after="180" w:line="264" w:lineRule="auto" w:before="60"/>
+        <w:jc w:val="center"/>
+      </w:pPr>
+      <w:r>
+        <w:rPr>
+          <w:b w:val="0"/>
+          <w:i/>
+          <w:sz w:val="18"/>
+        </w:rPr>
+        <w:t>Table 4.1. Planned work areas. Confirm the actual completed contributions with each member.</w:t>
       </w:r>
     </w:p>
     <w:p>

</xml_diff>

<commit_message>
docs: package final report and presentation
</commit_message>
<xml_diff>
--- a/docs/report/Warden-Mini-Project-Report.docx
+++ b/docs/report/Warden-Mini-Project-Report.docx
@@ -1285,11 +1285,7 @@
         <w:jc w:val="both"/>
       </w:pPr>
       <w:r>
-        <w:rPr>
-          <w:b w:val="0"/>
-          <w:i w:val="0"/>
-        </w:rPr>
-        <w:t>Warden brings service creation, software supply-chain checks, GitOps delivery, and automatic canary decisions into one Kubernetes platform. Five complete local trials created and deployed a service in a median of 8.6 minutes with no manual steps. In a separate 20-release canary experiment, all ten faulty releases aborted and all ten healthy releases promoted. Five successful Azure rebuilds demonstrated that the platform could be recreated from its recorded configuration.</w:t>
+        <w:t>We built Warden to bring service creation, software supply-chain checks, GitOps delivery, and automatic canary decisions into one Kubernetes platform. In five complete local trials, we created and deployed a service in a median of 8.6 minutes with no manual steps. In a separate 20-release canary experiment, all ten faulty releases aborted and all ten healthy releases promoted. We also completed five Azure rebuilds from recorded configuration.</w:t>
       </w:r>
     </w:p>
     <w:p>
@@ -1299,11 +1295,7 @@
         <w:jc w:val="both"/>
       </w:pPr>
       <w:r>
-        <w:rPr>
-          <w:b w:val="0"/>
-          <w:i w:val="0"/>
-        </w:rPr>
-        <w:t>These results address a practical engineering problem: a successful build does not by itself establish what will run in a cluster or how a faulty release will be contained. Warden links an image digest to its build evidence, promotes that digest through a controlled Git change, and evaluates the release under traffic. The four sample services, books, loans, members, and notify, provide repeatable workloads for testing this delivery path.</w:t>
+        <w:t>We addressed a practical engineering problem: a successful build does not by itself establish what will run in a cluster or how a faulty release will be contained. Warden links an image digest to its build evidence, promotes that digest through a controlled Git change, and evaluates the release under traffic. We used four deliberately small sample services, books, loans, members, and notify, to test this delivery path repeatedly.</w:t>
       </w:r>
     </w:p>
     <w:p>
@@ -1313,11 +1305,7 @@
         <w:jc w:val="both"/>
       </w:pPr>
       <w:r>
-        <w:rPr>
-          <w:b w:val="0"/>
-          <w:i w:val="0"/>
-        </w:rPr>
-        <w:t>The platform covers service creation, build and scanning, image signing, GitOps promotion, admission checks, progressive rollout, and a declarative PostgreSQL request. It runs locally on kind and was also rebuilt and measured on Azure Kubernetes Service (AKS). The same versioned configuration describes both environments.</w:t>
+        <w:t>Our platform covers service creation, build and scanning, image signing, GitOps promotion, admission checks, progressive rollout, and a declarative PostgreSQL request. We ran it locally on kind and rebuilt and measured it on Azure Kubernetes Service (AKS). The same versioned configuration describes both environments.</w:t>
       </w:r>
     </w:p>
     <w:p>
@@ -1336,11 +1324,7 @@
         <w:jc w:val="both"/>
       </w:pPr>
       <w:r>
-        <w:rPr>
-          <w:b w:val="0"/>
-          <w:i w:val="0"/>
-        </w:rPr>
-        <w:t>A valid image signature alone does not establish that the expected repository, branch, or workflow produced the image. Warden therefore checks the artifact digest and its build identity, while separating the pipeline from cluster credentials. The project set six measurable objectives:</w:t>
+        <w:t>A valid image signature alone does not establish that the expected repository, branch, or workflow produced an image. We therefore check the artifact digest and build identity, and keep the pipeline separate from cluster credentials. We set six measurable objectives:</w:t>
       </w:r>
     </w:p>
     <w:tbl>
@@ -1786,11 +1770,7 @@
         <w:jc w:val="both"/>
       </w:pPr>
       <w:r>
-        <w:rPr>
-          <w:b w:val="0"/>
-          <w:i w:val="0"/>
-        </w:rPr>
-        <w:t>AKS supplies managed Kubernetes; GitHub Actions runs the build; GitHub Container Registry stores immutable images; Microsoft Entra ID and GitHub OpenID Connect provide workload identity; Sigstore issues signing certificates and records transparency entries; Azure Storage holds encrypted OpenTofu state. Argo CD applies the GitOps repository, Argo Rollouts controls canary traffic, and Crossplane composes a CloudNativePG database. Together, these services cover compute, registry, identity, storage, infrastructure as code, and delivery automation.</w:t>
+        <w:t>We used AKS for managed Kubernetes; GitHub Actions for builds; GitHub Container Registry for immutable images; Microsoft Entra ID and GitHub OpenID Connect for workload identity; Sigstore for signing certificates and transparency entries; and Azure Storage for encrypted OpenTofu state. We used Argo CD for GitOps, Argo Rollouts for canaries, and Crossplane with CloudNativePG for databases. Together these services cover compute, registry, identity, storage, infrastructure as code, and delivery automation.</w:t>
       </w:r>
     </w:p>
     <w:p>
@@ -1800,11 +1780,7 @@
         <w:jc w:val="both"/>
       </w:pPr>
       <w:r>
-        <w:rPr>
-          <w:b w:val="0"/>
-          <w:i w:val="0"/>
-        </w:rPr>
-        <w:t>The implemented scope includes enforceable digest, registry, and Pod hygiene rules, a tested cryptographic policy in Audit, and self-service databases through CloudNativePG. Azure Flexible Server support is implemented on review branches but still needs a live provisioning and lifecycle test. Chapter 3 distinguishes controlled Deny-mode tests from installed enforcement. The evaluation also excludes production availability, multiple regions, and runtime intrusion detection.</w:t>
+        <w:t>We implemented enforceable digest, registry, and Pod-hygiene rules, a cryptographic policy tested in Audit, and self-service databases through CloudNativePG. Azure Flexible Server support is in open review PRs and still needs a live provisioning and lifecycle test. In Chapter 3, we distinguish controlled Deny-mode tests from installed enforcement. We did not evaluate production availability, multiple regions, or runtime intrusion detection.</w:t>
       </w:r>
     </w:p>
     <w:p>
@@ -1823,11 +1799,7 @@
         <w:jc w:val="both"/>
       </w:pPr>
       <w:r>
-        <w:rPr>
-          <w:b w:val="0"/>
-          <w:i w:val="0"/>
-        </w:rPr>
-        <w:t>The platform connects several established ideas. Borg illustrates declarative workload management and automated recovery in a shared cluster. The in-toto work treats software integrity as a property of the steps that produce an artifact. Sigstore makes artifact signing practical through identity-backed certificates, short-lived keys, and public transparency records. SLSA defines interoperable provenance for describing where, when, and how an artifact was built. Warden applies these ideas through Kubernetes orchestration and signed build provenance. [1], [2], [3], [4]</w:t>
+        <w:t>We drew on several established ideas. Borg illustrates declarative workload management and automated recovery in a shared cluster. The in-toto work treats software integrity as a property of the steps that produce an artifact. Sigstore makes artifact signing practical through identity-backed certificates, short-lived keys, and public transparency records. SLSA defines interoperable provenance for describing where, when, and how an artifact was built. We apply these ideas through Kubernetes orchestration and signed build provenance. [1], [2], [3], [4]</w:t>
       </w:r>
     </w:p>
     <w:p>
@@ -1837,11 +1809,7 @@
         <w:jc w:val="both"/>
       </w:pPr>
       <w:r>
-        <w:rPr>
-          <w:b w:val="0"/>
-          <w:i w:val="0"/>
-        </w:rPr>
-        <w:t>OpenGitOps describes desired state that is versioned, pulled automatically, and continuously reconciled. Google's canary-release guidance explains how partial deployments and observed behavior can inform a rollout decision. DORA provides a framework for measuring delivery throughput and instability. These sources supply the technical foundations for Warden's GitOps path, canary experiments, and delivery measurements. [5], [6], [7]</w:t>
+        <w:t>We also drew on OpenGitOps principles for versioned desired state and continuous pull-based reconciliation. Google's canary-release guidance informed our partial deployment and rollout decisions. We used DORA to measure delivery throughput and instability. These sources informed our GitOps path, canary experiments, and delivery measurements. [5], [6], [7]</w:t>
       </w:r>
     </w:p>
     <w:p>
@@ -1860,11 +1828,7 @@
         <w:jc w:val="both"/>
       </w:pPr>
       <w:r>
-        <w:rPr>
-          <w:b w:val="0"/>
-          <w:i w:val="0"/>
-        </w:rPr>
-        <w:t>The engineering contribution is the integration and evaluation of the complete delivery path. The project supplies a service-creation CLI, a reusable build and signing workflow, constrained promotion, policy fixtures, experiment runners, and delivery-metric calculations. Its evaluation reaches beyond a successful deployment: it attempts invalid artifacts, injects faults, checks controller reconciliation, and recreates the environment. This makes both the working behavior and the remaining gaps inspectable.</w:t>
+        <w:t>Our engineering contribution is the integration and evaluation of a complete delivery path. We built a service-creation CLI, a reusable build and signing workflow, constrained promotion, policy fixtures, experiment runners, and delivery-metric calculations. We tested invalid artifacts, injected faults, checked controller reconciliation, and rebuilt the environment. This let us inspect both working behavior and remaining gaps.</w:t>
       </w:r>
     </w:p>
     <w:p>
@@ -1948,11 +1912,7 @@
         <w:jc w:val="both"/>
       </w:pPr>
       <w:r>
-        <w:rPr>
-          <w:b w:val="0"/>
-          <w:i w:val="0"/>
-        </w:rPr>
-        <w:t>The project separates infrastructure, GitOps state, admission policies, and platform tooling into four repositories. OpenTofu prepares Azure resources. For local trials, a kind cluster replaces AKS while the GitOps and admission paths stay comparable. Pinned component versions and image digests keep rebuilds repeatable. Cluster creation and destruction were timed from a clean state, and failed attempts remain in the measurement records.</w:t>
+        <w:t>We separated infrastructure, GitOps state, admission policies, and platform tooling into four repositories. We use OpenTofu to prepare Azure resources. For local trials, we use kind in place of AKS while keeping the GitOps and admission paths comparable. Pinned component versions and image digests make our rebuilds repeatable. We timed cluster creation and destruction from a clean state, and retained failed attempts in the measurement records.</w:t>
       </w:r>
     </w:p>
     <w:p>
@@ -1971,11 +1931,7 @@
         <w:jc w:val="both"/>
       </w:pPr>
       <w:r>
-        <w:rPr>
-          <w:b w:val="0"/>
-          <w:i w:val="0"/>
-        </w:rPr>
-        <w:t>The Warden command creates a service repository, a small application, a reusable delivery workflow, deployment manifests, and a catalog entry. A push calls the shared platform workflow. It builds and scans the image, signs the digest, attaches provenance, and opens a narrow GitOps pull request that changes the deployed digest. The signing job alone receives an identity token. No delivery job receives cluster credentials; Argo CD later pulls the merged change. Third-party workflow actions are pinned to full commit hashes. The artifact identity and production steps follow software supply-chain practices described by in-toto and Sigstore [2], [3].</w:t>
+        <w:t>Our warden new command creates a service repository, a small application, a reusable delivery workflow, deployment manifests, and a catalog entry. A push calls our shared platform workflow, which builds and scans the image, signs its digest, attaches provenance, and opens a narrow GitOps pull request that changes the deployed digest. Only the signing job receives an identity token. No delivery job receives cluster credentials; Argo CD pulls the merged change. We pin third-party workflow actions to full commit hashes. Our artifact identity and production steps follow software supply-chain practices described by in-toto and Sigstore [2], [3].</w:t>
       </w:r>
     </w:p>
     <w:p>
@@ -1999,11 +1955,7 @@
         <w:jc w:val="both"/>
       </w:pPr>
       <w:r>
-        <w:rPr>
-          <w:b w:val="0"/>
-          <w:i w:val="0"/>
-        </w:rPr>
-        <w:t>A required digest-only check constrains each promotion pull request to one image digest. The promoter application can merge after that check passes. Argo CD applies the desired state. Native admission rules reject mutable tags, unapproved registries, and unsafe Pod settings. Kyverno verifies signatures and provenance against the intended build identity in Audit mode. For the controlled attack experiment, the same policy was exercised in Deny mode. Argo Rollouts then sends a small traffic share to the new version and uses Prometheus metrics to promote or abort it. Envoy Gateway supplies the route. Pull-based reconciliation and partial rollouts follow the GitOps and canary principles in [5] and [6].</w:t>
+        <w:t>We require each promotion pull request to pass a digest-only check that permits one image-digest change. After that check passes, our promoter application can merge the change. Argo CD applies the desired state. Our native admission rules reject mutable tags, unapproved registries, and unsafe Pod settings. Kyverno checks signatures and provenance against the intended build identity in Audit mode. For our controlled attack experiment, we exercised the same policy in Deny mode. Argo Rollouts then shifts a small share of traffic to the new version and uses Prometheus metrics to promote or abort it. Envoy Gateway supplies the route. Our pull-based reconciliation and partial rollouts follow GitOps and canary principles [5], [6].</w:t>
       </w:r>
     </w:p>
     <w:p>
@@ -2022,11 +1974,7 @@
         <w:jc w:val="both"/>
       </w:pPr>
       <w:r>
-        <w:rPr>
-          <w:b w:val="0"/>
-          <w:i w:val="0"/>
-        </w:rPr>
-        <w:t>The repositories separate the code that builds an application from the configuration that approves and deploys it. A service repository cannot directly rewrite the policy repository through its promotion credential. The build job cannot request a signing identity token; that permission belongs only to the signing job, which does not check out project code. This separation reduces the credentials available to application build scripts. The GitOps check also rejects a changed image name or an unrelated configuration edit.</w:t>
+        <w:t>We separated the repositories that build applications from the configuration that approves and deploys them. A service repository cannot rewrite the policy repository using its promotion credential. The build job cannot request a signing identity token; only the signing job has that permission, and it does not check out project code. This limits the credentials available to application build scripts. Our GitOps check also rejects a changed image name or an unrelated configuration edit.</w:t>
       </w:r>
     </w:p>
     <w:tbl>
@@ -2568,11 +2516,7 @@
         <w:jc w:val="both"/>
       </w:pPr>
       <w:r>
-        <w:rPr>
-          <w:b w:val="0"/>
-          <w:i w:val="0"/>
-        </w:rPr>
-        <w:t>A namespaced database request is reconciled by Crossplane and CloudNativePG. The composition creates a predictable connection Secret, allowing the application manifest to remain the same across kind and AKS. Database readiness and a client connection were recorded. Delivery metrics use deployment events rather than a transient cluster log. Attack outcomes, canary timing, rebuilds, and verification latency were retained with their experiment records.</w:t>
+        <w:t>We expose a namespaced database request through Crossplane and CloudNativePG. The composition creates a predictable connection Secret, so an application manifest can remain the same across kind and AKS. We recorded database readiness and a client connection. We compute delivery metrics from deployment events rather than transient cluster logs, and retain attack outcomes, canary timing, rebuilds, and verification latency with their experiment records.</w:t>
       </w:r>
     </w:p>
     <w:p>
@@ -2591,11 +2535,7 @@
         <w:jc w:val="both"/>
       </w:pPr>
       <w:r>
-        <w:rPr>
-          <w:b w:val="0"/>
-          <w:i w:val="0"/>
-        </w:rPr>
-        <w:t>The rollout advances through 5%, 25%, and 50% canary traffic before full promotion. A synthetic load supplies requests while Prometheus evaluates success rate and latency. The experiments inject either HTTP errors or extra latency, so both reliability and response time are tested. An unsuccessful analysis aborts the canary; a subsequent corrected release still passes through the normal build and promotion path. The report distinguishes time to abort from time to deploy a complete fix, following the canary approach described in [6].</w:t>
+        <w:t>We configure the rollout to advance through 5%, 25%, and 50% canary traffic before full promotion. Synthetic load supplies requests while Prometheus evaluates success rate and latency. We injected HTTP errors or extra latency to test both reliability and response time. An unsuccessful analysis aborts the canary, and a corrected release still passes through our normal build and promotion path. We distinguish time to abort from time to deploy a complete fix, following the canary approach described in [6].</w:t>
       </w:r>
     </w:p>
     <w:p>
@@ -2605,11 +2545,7 @@
         <w:jc w:val="both"/>
       </w:pPr>
       <w:r>
-        <w:rPr>
-          <w:b w:val="0"/>
-          <w:i w:val="0"/>
-        </w:rPr>
-        <w:t>Traffic routing required coordination between two controllers. Argo CD maintains the declared configuration, while Argo Rollouts must change route weights during a canary. Without an explicit field-ownership exception, reconciliation reset those weights and invalidated the intended experiment. The final configuration permits Rollouts to manage the traffic weights while Argo CD continues to reconcile the surrounding resource.</w:t>
+        <w:t>We had to coordinate two controllers that manage traffic routing. Argo CD maintains the declared configuration, while Argo Rollouts changes route weights during a canary. Without an explicit field-ownership exception, reconciliation reset those weights and invalidated the experiment. Our final configuration lets Rollouts manage traffic weights while Argo CD reconciles the surrounding resource.</w:t>
       </w:r>
     </w:p>
     <w:p>
@@ -2628,11 +2564,7 @@
         <w:jc w:val="both"/>
       </w:pPr>
       <w:r>
-        <w:rPr>
-          <w:b w:val="0"/>
-          <w:i w:val="0"/>
-        </w:rPr>
-        <w:t>Eight experiments cover service creation, security controls, canary behavior, database provisioning, delivery history, rebuilds, comparison with another platform, and verification overhead. Each stores the observation alongside its procedure. Successful rebuilds are summarized separately from failed attempts; a failed attempt remains in the measurement records. Release metrics are cross-checked against the experiment runner so that an incorrect event count does not become a performance claim. Metric definitions follow DORA's five measures of delivery performance [6].</w:t>
+        <w:t>We ran eight experiments covering service creation, security controls, canary behavior, database provisioning, delivery history, rebuilds, comparison with another platform, and verification overhead. We stored each observation with its procedure. We summarize successful rebuilds separately from failed attempts and retain the failures in the measurement records. We cross-check release metrics against the experiment runner so an incorrect event count does not become a performance claim. Our metric definitions follow DORA's five measures of delivery performance [6].</w:t>
       </w:r>
     </w:p>
     <w:p>
@@ -2642,11 +2574,7 @@
         <w:jc w:val="both"/>
       </w:pPr>
       <w:r>
-        <w:rPr>
-          <w:b w:val="0"/>
-          <w:i w:val="0"/>
-        </w:rPr>
-        <w:t>The environments answer different questions. kind makes repeated local trials affordable, while AKS tests cloud provisioning, reconciliation, and the policy path on managed Kubernetes. Results are labeled by environment because one successful local series does not establish identical cloud behavior. Small samples and deliberate fault injection limit the conclusions: the experiments demonstrate the recorded behavior, not a production reliability rate.</w:t>
+        <w:t>We used kind for affordable repeated local trials and AKS to test cloud provisioning, reconciliation, and policy behavior on managed Kubernetes. We label results by environment because a successful local series does not establish identical cloud behavior. Our small samples and deliberate fault injection limit the conclusions: these experiments demonstrate the recorded behavior, not a production reliability rate.</w:t>
       </w:r>
     </w:p>
     <w:p>
@@ -3437,11 +3365,7 @@
         <w:jc w:val="both"/>
       </w:pPr>
       <w:r>
-        <w:rPr>
-          <w:b w:val="0"/>
-          <w:i w:val="0"/>
-        </w:rPr>
-        <w:t>The five complete service-creation runs finished below the 15-minute target. The resumed books run is excluded from this sample. The result demonstrates the automated local path, while the planned Azure series and hand-timed baseline remain open.</w:t>
+        <w:t>Our five complete service-creation runs finished below the 15-minute target. We excluded the resumed books run from this sample. These results demonstrate our automated local path; our planned Azure series and hand-timed baseline remain open.</w:t>
       </w:r>
     </w:p>
     <w:p>
@@ -3516,11 +3440,7 @@
         <w:jc w:val="both"/>
       </w:pPr>
       <w:r>
-        <w:rPr>
-          <w:b w:val="0"/>
-          <w:i w:val="0"/>
-        </w:rPr>
-        <w:t>The controlled rollout series contained ten deliberately faulty and ten healthy releases. Every faulty release aborted, and every healthy release promoted. The median time from rollout start to abort was 147.2 seconds; the healthy promotion median was 471.6 seconds. The error trials exposed a median 0.397% of requests to the faulty canary, below the planned 0.5% share. The run data supports the rollback claim for kind; no comparable Azure canary series was run.</w:t>
+        <w:t>In our controlled rollout series, we tested ten deliberately faulty and ten healthy releases. All faulty releases aborted, and all healthy releases promoted. The median time from rollout start to abort was 147.2 seconds; the healthy promotion median was 471.6 seconds. The error trials exposed a median 0.397% of requests to the faulty canary, below the planned 0.5% share. These runs support the rollback claim for kind; we did not run a comparable Azure canary series.</w:t>
       </w:r>
     </w:p>
     <w:p>
@@ -3581,11 +3501,7 @@
         <w:jc w:val="both"/>
       </w:pPr>
       <w:r>
-        <w:rPr>
-          <w:b w:val="0"/>
-          <w:i w:val="0"/>
-        </w:rPr>
-        <w:t>The ten faulty trials comprise five error and five latency injections. In the error trials, the observed request failure share ranged from 0.325% to 0.509%; its median was 0.397%. The latency trials slowed a median 4.08% of service requests and produced no HTTP errors. These measures describe different failure modes and should not be combined into one success percentage.</w:t>
+        <w:t>We split the ten faulty trials between five error and five latency injections. In the error trials, the observed request failure share ranged from 0.325% to 0.509%; its median was 0.397%. The latency trials slowed a median 4.08% of service requests and produced no HTTP errors. We report these measures separately because they describe different failure modes.</w:t>
       </w:r>
     </w:p>
     <w:p>
@@ -3595,11 +3511,7 @@
         <w:jc w:val="both"/>
       </w:pPr>
       <w:r>
-        <w:rPr>
-          <w:b w:val="0"/>
-          <w:i w:val="0"/>
-        </w:rPr>
-        <w:t>A quick abort also differs from complete recovery. The median interval from abort to a corrected release being fully promoted was 759.2 seconds, including the new build and canary. A single healthy trial took 1,209.5 seconds to promote, while the other healthy trials took 466.2–474.1 seconds. Keeping that outlier visible shows the spread that a median alone would hide.</w:t>
+        <w:t>We distinguish a quick abort from complete recovery. The median interval from abort to a corrected release being fully promoted was 759.2 seconds, including the new build and canary. One healthy trial took 1,209.5 seconds to promote; the other healthy trials took 466.2–474.1 seconds. We retain that outlier because the median alone would hide the spread.</w:t>
       </w:r>
     </w:p>
     <w:p>
@@ -3623,11 +3535,7 @@
         <w:jc w:val="both"/>
       </w:pPr>
       <w:r>
-        <w:rPr>
-          <w:b w:val="0"/>
-          <w:i w:val="0"/>
-        </w:rPr>
-        <w:t>The original 2026-10-26 E5 batch used owner merges after the digest-only check. Its 20% failure rate was planned and its lead time excluded human review. The separate 2026-10-27 app-only repeat records 20 deployments, five per service, with 16 successful and four injected-fault deployments. The promoter app merged every promotion after the required digest-only check, without an owner merge. Median change lead time was 12.5 minutes, change fail and rework rates were 20%, and median failed-deployment recovery was 12.6 minutes. The short synthetic batch does not describe normal team delivery frequency.</w:t>
+        <w:t>We ran two E5 batches. In the original 2026-10-26 batch, we used owner merges after the digest-only check. We planned its 20% failure rate, and its lead time excludes human review. Our separate 2026-10-27 app-only repeat records 20 deployments, five per service, with 16 successful and four injected-fault deployments. The promoter app merged each promotion after the required digest-only check, without an owner merge. Median change lead time was 12.5 minutes, change fail and rework rates were 20%, and median failed-deployment recovery was 12.6 minutes. This short synthetic batch does not represent normal team delivery frequency.</w:t>
       </w:r>
     </w:p>
     <w:p>
@@ -3637,11 +3545,7 @@
         <w:jc w:val="both"/>
       </w:pPr>
       <w:r>
-        <w:rPr>
-          <w:b w:val="0"/>
-          <w:i w:val="0"/>
-        </w:rPr>
-        <w:t>The canary records for the app-only repeat show 12 healthy promotions and four injected-error releases aborted by the success-rate analysis, each followed by a healthy fix. Fault aborts took a median 147.6 seconds, with 0.39% of requests failing during the canary at a 5% traffic share. Abort-to-fixed median was 756.6 seconds. One members CI capture timed out and a second healthy attempt overlapped the members fault test; both are retained as excluded records. The 20 deployments in the GitHub ledger agree with the measured set.</w:t>
+        <w:t>Our canary records for the app-only repeat show 12 healthy promotions and four injected-error releases aborted by the success-rate analysis, each followed by a healthy fix. Fault aborts took a median 147.6 seconds, with 0.39% of requests failing during the canary at a 5% traffic share. Abort-to-fixed median was 756.6 seconds. We retained one timed-out members CI capture and one healthy attempt that overlapped the members fault test as excluded records. The 20 deployments in the GitHub ledger agree with our measured set.</w:t>
       </w:r>
     </w:p>
     <w:tbl>
@@ -4341,11 +4245,7 @@
         <w:jc w:val="both"/>
       </w:pPr>
       <w:r>
-        <w:rPr>
-          <w:b w:val="0"/>
-          <w:i w:val="0"/>
-        </w:rPr>
-        <w:t>The resulting deployment frequency, about 250 per day in this short test window, describes the scripted batch and is not a useful estimate of normal team cadence.</w:t>
+        <w:t>Our calculated deployment frequency is about 250 per day in this short test window. We do not interpret that scripted rate as normal team cadence.</w:t>
       </w:r>
     </w:p>
     <w:tbl>
@@ -4793,11 +4693,7 @@
         <w:jc w:val="both"/>
       </w:pPr>
       <w:r>
-        <w:rPr>
-          <w:b w:val="0"/>
-          <w:i w:val="0"/>
-        </w:rPr>
-        <w:t>Local rebuilds succeeded in 11 of 12 recorded runs, with a median of 14.9 minutes and a 24.2-minute 90th percentile. Five Azure rebuilds succeeded from an empty state with a median of 22 minutes. Four failed Azure attempts remain in the measurement records and were analyzed rather than discarded.</w:t>
+        <w:t>We recorded 11 successful local rebuilds out of 12, with a median of 14.9 minutes and a 24.2-minute 90th percentile. We also completed five Azure rebuilds from an empty state with a median of 22 minutes. We retained and analyzed four failed Azure attempts instead of discarding them.</w:t>
       </w:r>
     </w:p>
     <w:p>
@@ -4816,11 +4712,7 @@
         <w:jc w:val="both"/>
       </w:pPr>
       <w:r>
-        <w:rPr>
-          <w:b w:val="0"/>
-          <w:i w:val="0"/>
-        </w:rPr>
-        <w:t>All 15 checks passed on kind and AKS, but they do not represent 15 admission rejections. The suite contains one admitted positive control, eight direct admission denials, one ReplicaSet case whose child Pods were refused, and five checks covering earlier prevention, credential absence, signing permissions, promotion constraints, and drift recovery. In the drift test, the policy was restored after 1.4 seconds on kind and 1.6 seconds on AKS.</w:t>
+        <w:t>Our attack suite passed all 15 checks on kind and AKS, but those results do not represent 15 admission rejections. The suite includes one admitted positive control, eight direct admission denials, one ReplicaSet case whose child Pods were refused, and five checks covering earlier prevention, credential absence, signing permissions, promotion constraints, and drift recovery. In the drift test, we restored the policy after 1.4 seconds on kind and 1.6 seconds on AKS.</w:t>
       </w:r>
     </w:p>
     <w:p>
@@ -4830,11 +4722,7 @@
         <w:jc w:val="both"/>
       </w:pPr>
       <w:r>
-        <w:rPr>
-          <w:b w:val="0"/>
-          <w:i w:val="0"/>
-        </w:rPr>
-        <w:t>This gives evidence for controls at several points in the delivery path. It does not establish fail-closed operation of the installed image policy, which remains in Audit. Warm verification added about 14–15 seconds per Pod, and transient registry or TUF fetch errors interrupted some legitimate checks. A new readiness run is required before enforcement changes.</w:t>
+        <w:t>These results show controls at several points in our delivery path. They do not establish fail-closed operation of the installed image policy, which remains in Audit. Warm verification added about 14–15 seconds per Pod, and transient registry or TUF fetch errors interrupted some legitimate checks. We need another readiness run before changing enforcement.</w:t>
       </w:r>
     </w:p>
     <w:p>
@@ -4844,11 +4732,7 @@
         <w:jc w:val="both"/>
       </w:pPr>
       <w:r>
-        <w:rPr>
-          <w:b w:val="0"/>
-          <w:i w:val="0"/>
-        </w:rPr>
-        <w:t>The measured database request worked in both environments and generated a usable connection URI, with CloudNativePG selected on kind and AKS. Azure Flexible Server support is now implemented in draft infrastructure and GitOps pull requests but has not been merged or tested live. The result establishes portability of the request and Secret contract across clusters, not yet across database providers.</w:t>
+        <w:t>Our measured database request worked in both environments and generated a usable connection URI; we used CloudNativePG on kind and AKS. Azure Flexible Server support is implemented in open infrastructure and GitOps pull requests but has not been merged or tested live. Our results establish portability of the request and Secret contract across clusters, not yet across database providers.</w:t>
       </w:r>
     </w:p>
     <w:p>
@@ -4872,11 +4756,7 @@
         <w:jc w:val="both"/>
       </w:pPr>
       <w:r>
-        <w:rPr>
-          <w:b w:val="0"/>
-          <w:i w:val="0"/>
-        </w:rPr>
-        <w:t>The idpbuilder comparison helps explain Warden's resource cost. In one recorded run, idpbuilder reached GitOps and a first application in 8.5 minutes using 2.2 GiB. Warden's recorded platform footprint was 8.8 GiB and included admission checks, canary analysis, observability, and database infrastructure. The bootstrap paths differed: the baseline deployed a pre-built public image, while Warden's service-creation experiment included repository creation, building, signing, and promotion. The comparison describes scope and resource use; it is not an equal-feature speed benchmark.</w:t>
+        <w:t>We compared Warden with idpbuilder to understand the platform resource cost. In one recorded run, idpbuilder reached GitOps and a first application in 8.5 minutes using 2.2 GiB. Our recorded platform footprint was 8.8 GiB and included admission checks, canary analysis, observability, and database infrastructure. The bootstrap paths differed: the baseline deployed a pre-built public image, while our service-creation experiment included repository creation, building, signing, and promotion. This comparison describes scope and resource use; it is not an equal-feature speed benchmark.</w:t>
       </w:r>
     </w:p>
     <w:p>
@@ -4895,11 +4775,7 @@
         <w:jc w:val="both"/>
       </w:pPr>
       <w:r>
-        <w:rPr>
-          <w:b w:val="0"/>
-          <w:i w:val="0"/>
-        </w:rPr>
-        <w:t>Several results depended on resolving interactions between components. The first promotion fix failed because the command-line client refused a blocked pull request before the server could apply the promoter's review bypass. Calling the merge endpoint with the expected head commit resolved that path; the digest-only check remained mandatory. The four later service releases provide direct evidence that the revised path worked.</w:t>
+        <w:t>We had to resolve interactions between components to make several results possible. Our first promotion fix failed because the command-line client refused a blocked pull request before the server could apply the promoter's review bypass. Calling the merge endpoint with the expected head commit resolved the path while keeping the digest-only check mandatory. The four later service releases provide direct evidence that the revised path worked.</w:t>
       </w:r>
     </w:p>
     <w:p>
@@ -4909,11 +4785,7 @@
         <w:jc w:val="both"/>
       </w:pPr>
       <w:r>
-        <w:rPr>
-          <w:b w:val="0"/>
-          <w:i w:val="0"/>
-        </w:rPr>
-        <w:t>Measurement code also needed validation. An early delivery-metric calculation counted only eight of twenty releases because older GitHub deployments became inactive and reconciliation announced a revision across multiple applications. Cross-checking the event ledger against the experiment runner exposed both errors. The corrected result counts twenty releases and four injected failures.</w:t>
+        <w:t>We also validated our measurement code. An early delivery-metric calculation counted only eight of twenty releases because older GitHub deployments became inactive and reconciliation announced a revision across multiple applications. We compared the event ledger against the experiment runner and found both errors. Our corrected result counts twenty releases and four injected failures.</w:t>
       </w:r>
     </w:p>
     <w:p>
@@ -4923,11 +4795,7 @@
         <w:jc w:val="both"/>
       </w:pPr>
       <w:r>
-        <w:rPr>
-          <w:b w:val="0"/>
-          <w:i w:val="0"/>
-        </w:rPr>
-        <w:t>Database integration exposed another issue: operator-created Pods and initialization Jobs need narrowly scoped admission exceptions. A rule that looked acceptable in Audit could have blocked the database in Deny. Testing legitimate workload classes alongside attacks was necessary to judge the policy. The experiments also exposed controller and measurement problems that a successful deployment alone would not have found.</w:t>
+        <w:t>We found another admission issue during database integration: operator-created Pods and initialization Jobs need narrowly scoped exceptions. A rule that appeared acceptable in Audit could have blocked every database in Deny mode. We tested legitimate workload classes alongside attacks to evaluate the policy. These experiments also exposed controller and measurement problems that a successful deployment alone would not have revealed.</w:t>
       </w:r>
     </w:p>
     <w:p>
@@ -4951,11 +4819,7 @@
         <w:jc w:val="both"/>
       </w:pPr>
       <w:r>
-        <w:rPr>
-          <w:b w:val="0"/>
-          <w:i w:val="0"/>
-        </w:rPr>
-        <w:t>Warden demonstrates a working Kubernetes delivery platform whose key behaviors can be traced to recorded experiments. It combines service scaffolding, an isolated signing workflow, digest promotion, admission controls, canary analysis, database requests, and repeatable infrastructure. The local service-creation median was 8.6 minutes; the app-only canary batch aborted all four injected faults and promoted all 12 measured healthy releases; and five Azure rebuilds recreated the platform with a median duration of about 22 minutes. These outcomes show an integrated system that was exercised beyond a single successful deployment.</w:t>
+        <w:t>We demonstrated a working Kubernetes delivery platform whose key behaviors are traceable to recorded experiments. Our platform combines service scaffolding, an isolated signing workflow, digest promotion, admission controls, canary analysis, database requests, and repeatable infrastructure. We measured a local service-creation median of 8.6 minutes; in the app-only canary batch, all four injected faults aborted and all 12 measured healthy releases promoted; five Azure rebuilds recreated the platform in a median of about 22 minutes. We exercised the system beyond a single successful deployment.</w:t>
       </w:r>
     </w:p>
     <w:p>
@@ -4965,11 +4829,7 @@
         <w:jc w:val="both"/>
       </w:pPr>
       <w:r>
-        <w:rPr>
-          <w:b w:val="0"/>
-          <w:i w:val="0"/>
-        </w:rPr>
-        <w:t>Two promised outcomes need more work before they can be described as complete. The installed cryptographic admission policy still audits instead of denying, even though a controlled Deny-mode suite passed. Azure Flexible Server code is staged for review and still needs a live test. The E1 sample is also smaller than planned. These boundaries distinguish a tested feature from a production-ready path.</w:t>
+        <w:t>We still need more work before claiming two promised outcomes are complete. Our installed cryptographic admission policy remains in Audit, even though a controlled Deny-mode suite passed. The Azure Flexible Server code is in review and still needs a live test. Our E1 sample is also smaller than planned. These limits separate features we tested from paths that are ready for production.</w:t>
       </w:r>
     </w:p>
     <w:p>
@@ -4979,11 +4839,7 @@
         <w:jc w:val="both"/>
       </w:pPr>
       <w:r>
-        <w:rPr>
-          <w:b w:val="0"/>
-          <w:i w:val="0"/>
-        </w:rPr>
-        <w:t>The next engineering steps are to remeasure image verification after a Kyverno fix, including legitimate Pods, registry failures, and timeout behavior before changing Audit to Deny; review and merge the Azure database changes, then test connection, deletion, and teardown; and expand service-creation and canary measurements on AKS. The report preserves what has been demonstrated and the evidence still needed for those claims.</w:t>
+        <w:t>Our next steps are to remeasure image verification after a Kyverno fix, including legitimate Pods, registry failures, and timeout behavior before changing Audit to Deny; review and merge the Azure database changes, then test connection, deletion, and teardown; and expand our service-creation and canary measurements on AKS. We preserve the evidence for completed claims and identify the additional evidence these claims still need.</w:t>
       </w:r>
     </w:p>
     <w:p>
@@ -5007,11 +4863,7 @@
         <w:jc w:val="both"/>
       </w:pPr>
       <w:r>
-        <w:rPr>
-          <w:b w:val="0"/>
-          <w:i w:val="0"/>
-        </w:rPr>
-        <w:t>The table records the project plan's responsibility allocation. Each member should confirm that the assigned area reflects work they personally completed before submission.</w:t>
+        <w:t>We confirmed the responsibility areas below as a team. They describe contribution areas, not a commit-by-commit authorship record; the repository history does not capture all of our design, review, evaluation, integration, and presentation work. Abhyuday Gupta led the architecture, core platform implementation, and cross-repository integration.</w:t>
       </w:r>
     </w:p>
     <w:tbl>
@@ -5051,15 +4903,7 @@
             </w:tcMar>
           </w:tcPr>
           <w:p>
-            <w:pPr>
-              <w:spacing w:after="0"/>
-            </w:pPr>
-            <w:r>
-              <w:rPr>
-                <w:rFonts w:ascii="Times New Roman" w:hAnsi="Times New Roman"/>
-                <w:b/>
-                <w:sz w:val="20"/>
-              </w:rPr>
+            <w:r>
               <w:t>Member</w:t>
             </w:r>
           </w:p>
@@ -5076,16 +4920,8 @@
             </w:tcMar>
           </w:tcPr>
           <w:p>
-            <w:pPr>
-              <w:spacing w:after="0"/>
-            </w:pPr>
-            <w:r>
-              <w:rPr>
-                <w:rFonts w:ascii="Times New Roman" w:hAnsi="Times New Roman"/>
-                <w:b/>
-                <w:sz w:val="20"/>
-              </w:rPr>
-              <w:t>Assigned area</w:t>
+            <w:r>
+              <w:t>Contribution area</w:t>
             </w:r>
           </w:p>
         </w:tc>
@@ -5106,15 +4942,7 @@
             </w:tcMar>
           </w:tcPr>
           <w:p>
-            <w:pPr>
-              <w:spacing w:after="0"/>
-            </w:pPr>
-            <w:r>
-              <w:rPr>
-                <w:rFonts w:ascii="Times New Roman" w:hAnsi="Times New Roman"/>
-                <w:b w:val="0"/>
-                <w:sz w:val="20"/>
-              </w:rPr>
+            <w:r>
               <w:t>Abhyuday Gupta</w:t>
             </w:r>
           </w:p>
@@ -5131,16 +4959,8 @@
             </w:tcMar>
           </w:tcPr>
           <w:p>
-            <w:pPr>
-              <w:spacing w:after="0"/>
-            </w:pPr>
-            <w:r>
-              <w:rPr>
-                <w:rFonts w:ascii="Times New Roman" w:hAnsi="Times New Roman"/>
-                <w:b w:val="0"/>
-                <w:sz w:val="20"/>
-              </w:rPr>
-              <w:t>Platform architecture, trusted build workflow, CLI, integration, and evidence review</w:t>
+            <w:r>
+              <w:t>System architecture, trusted build workflow and CLI, cross-repository integration, and final evidence review</w:t>
             </w:r>
           </w:p>
         </w:tc>
@@ -5161,15 +4981,7 @@
             </w:tcMar>
           </w:tcPr>
           <w:p>
-            <w:pPr>
-              <w:spacing w:after="0"/>
-            </w:pPr>
-            <w:r>
-              <w:rPr>
-                <w:rFonts w:ascii="Times New Roman" w:hAnsi="Times New Roman"/>
-                <w:b w:val="0"/>
-                <w:sz w:val="20"/>
-              </w:rPr>
+            <w:r>
               <w:t>Aditya Chetan Thakur</w:t>
             </w:r>
           </w:p>
@@ -5186,16 +4998,8 @@
             </w:tcMar>
           </w:tcPr>
           <w:p>
-            <w:pPr>
-              <w:spacing w:after="0"/>
-            </w:pPr>
-            <w:r>
-              <w:rPr>
-                <w:rFonts w:ascii="Times New Roman" w:hAnsi="Times New Roman"/>
-                <w:b w:val="0"/>
-                <w:sz w:val="20"/>
-              </w:rPr>
-              <w:t>Infrastructure, managed database path, and Azure rebuild evaluation</w:t>
+            <w:r>
+              <w:t>Azure and local infrastructure, Crossplane database path, and rebuild evaluation</w:t>
             </w:r>
           </w:p>
         </w:tc>
@@ -5216,15 +5020,7 @@
             </w:tcMar>
           </w:tcPr>
           <w:p>
-            <w:pPr>
-              <w:spacing w:after="0"/>
-            </w:pPr>
-            <w:r>
-              <w:rPr>
-                <w:rFonts w:ascii="Times New Roman" w:hAnsi="Times New Roman"/>
-                <w:b w:val="0"/>
-                <w:sz w:val="20"/>
-              </w:rPr>
+            <w:r>
               <w:t>Sankalp Arya</w:t>
             </w:r>
           </w:p>
@@ -5241,16 +5037,8 @@
             </w:tcMar>
           </w:tcPr>
           <w:p>
-            <w:pPr>
-              <w:spacing w:after="0"/>
-            </w:pPr>
-            <w:r>
-              <w:rPr>
-                <w:rFonts w:ascii="Times New Roman" w:hAnsi="Times New Roman"/>
-                <w:b w:val="0"/>
-                <w:sz w:val="20"/>
-              </w:rPr>
-              <w:t>Admission policies, threat model, and attack-suite evaluation</w:t>
+            <w:r>
+              <w:t>Admission policy design and readiness, attack suite, threat model, and upstream policy reports</w:t>
             </w:r>
           </w:p>
         </w:tc>
@@ -5271,15 +5059,7 @@
             </w:tcMar>
           </w:tcPr>
           <w:p>
-            <w:pPr>
-              <w:spacing w:after="0"/>
-            </w:pPr>
-            <w:r>
-              <w:rPr>
-                <w:rFonts w:ascii="Times New Roman" w:hAnsi="Times New Roman"/>
-                <w:b w:val="0"/>
-                <w:sz w:val="20"/>
-              </w:rPr>
+            <w:r>
               <w:t>Shaurya Jain</w:t>
             </w:r>
           </w:p>
@@ -5296,16 +5076,8 @@
             </w:tcMar>
           </w:tcPr>
           <w:p>
-            <w:pPr>
-              <w:spacing w:after="0"/>
-            </w:pPr>
-            <w:r>
-              <w:rPr>
-                <w:rFonts w:ascii="Times New Roman" w:hAnsi="Times New Roman"/>
-                <w:b w:val="0"/>
-                <w:sz w:val="20"/>
-              </w:rPr>
-              <w:t>GitOps delivery, canary rollout, and observability evaluation</w:t>
+            <w:r>
+              <w:t>GitOps delivery configuration, rollout and observability validation, and presentation/demo preparation</w:t>
             </w:r>
           </w:p>
         </w:tc>
@@ -5318,12 +5090,7 @@
         <w:jc w:val="center"/>
       </w:pPr>
       <w:r>
-        <w:rPr>
-          <w:b w:val="0"/>
-          <w:i/>
-          <w:sz w:val="18"/>
-        </w:rPr>
-        <w:t>Table 4.1. Planned work areas. Confirm the actual completed contributions with each member.</w:t>
+        <w:t>Table 4.1. Team contribution areas.</w:t>
       </w:r>
     </w:p>
     <w:p>

</xml_diff>

<commit_message>
docs: report team contributions collectively
</commit_message>
<xml_diff>
--- a/docs/report/Warden-Mini-Project-Report.docx
+++ b/docs/report/Warden-Mini-Project-Report.docx
@@ -1230,7 +1230,7 @@
           <w:i w:val="0"/>
           <w:sz w:val="22"/>
         </w:rPr>
-        <w:t>TEAM RESPONSIBILITIES</w:t>
+        <w:t>TEAM CONTRIBUTIONS</w:t>
         <w:tab/>
         <w:t>15</w:t>
       </w:r>
@@ -4853,7 +4853,7 @@
         <w:spacing w:before="220" w:after="100"/>
       </w:pPr>
       <w:r>
-        <w:t>TEAM RESPONSIBILITIES</w:t>
+        <w:t>TEAM CONTRIBUTIONS</w:t>
       </w:r>
     </w:p>
     <w:p>
@@ -4863,7 +4863,7 @@
         <w:jc w:val="both"/>
       </w:pPr>
       <w:r>
-        <w:t>We confirmed the responsibility areas below as a team. They describe contribution areas, not a commit-by-commit authorship record; the repository history does not capture all of our design, review, evaluation, integration, and presentation work. Abhyuday Gupta led the architecture, core platform implementation, and cross-repository integration.</w:t>
+        <w:t>We completed Warden as a four-person team: Abhyuday Gupta, Aditya Chetan Thakur, Sankalp Arya and Shaurya Jain. Across the team, the work covered architecture, infrastructure, the build workflow and CLI, policy and attack testing, GitOps and rollout checks, evaluation, documentation and presentation. Abhyuday led the architecture, core platform implementation, cross-repository integration and final evidence review. We report the other areas as shared team work because we did not keep a verified task-level record assigning each one to a specific member.</w:t>
       </w:r>
     </w:p>
     <w:tbl>
@@ -4904,7 +4904,7 @@
           </w:tcPr>
           <w:p>
             <w:r>
-              <w:t>Member</w:t>
+              <w:t>Member(s)</w:t>
             </w:r>
           </w:p>
         </w:tc>
@@ -4921,7 +4921,7 @@
           </w:tcPr>
           <w:p>
             <w:r>
-              <w:t>Contribution area</w:t>
+              <w:t>Contribution</w:t>
             </w:r>
           </w:p>
         </w:tc>
@@ -4943,7 +4943,7 @@
           </w:tcPr>
           <w:p>
             <w:r>
-              <w:t>Abhyuday Gupta</w:t>
+              <w:t>All four team members</w:t>
             </w:r>
           </w:p>
         </w:tc>
@@ -4960,7 +4960,7 @@
           </w:tcPr>
           <w:p>
             <w:r>
-              <w:t>System architecture, trusted build workflow and CLI, cross-repository integration, and final evidence review</w:t>
+              <w:t>Shared work across architecture, infrastructure, platform implementation, policies and attacks, GitOps and rollouts, evaluation, documentation and presentation.</w:t>
             </w:r>
           </w:p>
         </w:tc>
@@ -4982,7 +4982,7 @@
           </w:tcPr>
           <w:p>
             <w:r>
-              <w:t>Aditya Chetan Thakur</w:t>
+              <w:t>Abhyuday Gupta</w:t>
             </w:r>
           </w:p>
         </w:tc>
@@ -4999,85 +4999,7 @@
           </w:tcPr>
           <w:p>
             <w:r>
-              <w:t>Azure and local infrastructure, Crossplane database path, and rebuild evaluation</w:t>
-            </w:r>
-          </w:p>
-        </w:tc>
-      </w:tr>
-      <w:tr>
-        <w:trPr>
-          <w:cantSplit/>
-        </w:trPr>
-        <w:tc>
-          <w:tcPr>
-            <w:tcW w:type="dxa" w:w="2835"/>
-            <w:vAlign w:val="center"/>
-            <w:tcMar>
-              <w:top w:w="65" w:type="dxa"/>
-              <w:left w:w="65" w:type="dxa"/>
-              <w:bottom w:w="65" w:type="dxa"/>
-              <w:right w:w="65" w:type="dxa"/>
-            </w:tcMar>
-          </w:tcPr>
-          <w:p>
-            <w:r>
-              <w:t>Sankalp Arya</w:t>
-            </w:r>
-          </w:p>
-        </w:tc>
-        <w:tc>
-          <w:tcPr>
-            <w:tcW w:type="dxa" w:w="6236"/>
-            <w:vAlign w:val="center"/>
-            <w:tcMar>
-              <w:top w:w="65" w:type="dxa"/>
-              <w:left w:w="65" w:type="dxa"/>
-              <w:bottom w:w="65" w:type="dxa"/>
-              <w:right w:w="65" w:type="dxa"/>
-            </w:tcMar>
-          </w:tcPr>
-          <w:p>
-            <w:r>
-              <w:t>Admission policy design and readiness, attack suite, threat model, and upstream policy reports</w:t>
-            </w:r>
-          </w:p>
-        </w:tc>
-      </w:tr>
-      <w:tr>
-        <w:trPr>
-          <w:cantSplit/>
-        </w:trPr>
-        <w:tc>
-          <w:tcPr>
-            <w:tcW w:type="dxa" w:w="2835"/>
-            <w:vAlign w:val="center"/>
-            <w:tcMar>
-              <w:top w:w="65" w:type="dxa"/>
-              <w:left w:w="65" w:type="dxa"/>
-              <w:bottom w:w="65" w:type="dxa"/>
-              <w:right w:w="65" w:type="dxa"/>
-            </w:tcMar>
-          </w:tcPr>
-          <w:p>
-            <w:r>
-              <w:t>Shaurya Jain</w:t>
-            </w:r>
-          </w:p>
-        </w:tc>
-        <w:tc>
-          <w:tcPr>
-            <w:tcW w:type="dxa" w:w="6236"/>
-            <w:vAlign w:val="center"/>
-            <w:tcMar>
-              <w:top w:w="65" w:type="dxa"/>
-              <w:left w:w="65" w:type="dxa"/>
-              <w:bottom w:w="65" w:type="dxa"/>
-              <w:right w:w="65" w:type="dxa"/>
-            </w:tcMar>
-          </w:tcPr>
-          <w:p>
-            <w:r>
-              <w:t>GitOps delivery configuration, rollout and observability validation, and presentation/demo preparation</w:t>
+              <w:t>Led architecture, core platform implementation, cross-repository integration, and final evidence review.</w:t>
             </w:r>
           </w:p>
         </w:tc>
@@ -5090,7 +5012,7 @@
         <w:jc w:val="center"/>
       </w:pPr>
       <w:r>
-        <w:t>Table 4.1. Team contribution areas.</w:t>
+        <w:t>Table 4.1. Team contributions.</w:t>
       </w:r>
     </w:p>
     <w:p>

</xml_diff>

<commit_message>
docs: align team contributions across report exports
</commit_message>
<xml_diff>
--- a/docs/report/Warden-Mini-Project-Report.docx
+++ b/docs/report/Warden-Mini-Project-Report.docx
@@ -4863,7 +4863,7 @@
         <w:jc w:val="both"/>
       </w:pPr>
       <w:r>
-        <w:t>We completed Warden as a four-person team: Abhyuday Gupta, Aditya Chetan Thakur, Sankalp Arya and Shaurya Jain. Across the team, the work covered architecture, infrastructure, the build workflow and CLI, policy and attack testing, GitOps and rollout checks, evaluation, documentation and presentation. Abhyuday led the architecture, core platform implementation, cross-repository integration and final evidence review. We report the other areas as shared team work because we did not keep a verified task-level record assigning each one to a specific member.</w:t>
+        <w:t>We completed Warden as a four-person team. Our main contribution areas were:</w:t>
       </w:r>
     </w:p>
     <w:tbl>
@@ -4883,8 +4883,8 @@
         </w:tblBorders>
       </w:tblPr>
       <w:tblGrid>
-        <w:gridCol w:w="2835"/>
-        <w:gridCol w:w="6236"/>
+        <w:gridCol w:w="2592"/>
+        <w:gridCol w:w="7776"/>
       </w:tblGrid>
       <w:tr>
         <w:trPr>
@@ -4893,35 +4893,41 @@
         </w:trPr>
         <w:tc>
           <w:tcPr>
-            <w:tcW w:type="dxa" w:w="2835"/>
-            <w:vAlign w:val="center"/>
-            <w:tcMar>
-              <w:top w:w="65" w:type="dxa"/>
-              <w:left w:w="65" w:type="dxa"/>
-              <w:bottom w:w="65" w:type="dxa"/>
-              <w:right w:w="65" w:type="dxa"/>
-            </w:tcMar>
-          </w:tcPr>
-          <w:p>
-            <w:r>
-              <w:t>Member(s)</w:t>
-            </w:r>
-          </w:p>
-        </w:tc>
-        <w:tc>
-          <w:tcPr>
-            <w:tcW w:type="dxa" w:w="6236"/>
-            <w:vAlign w:val="center"/>
-            <w:tcMar>
-              <w:top w:w="65" w:type="dxa"/>
-              <w:left w:w="65" w:type="dxa"/>
-              <w:bottom w:w="65" w:type="dxa"/>
-              <w:right w:w="65" w:type="dxa"/>
-            </w:tcMar>
-          </w:tcPr>
-          <w:p>
-            <w:r>
-              <w:t>Contribution</w:t>
+            <w:tcW w:type="dxa" w:w="2592"/>
+            <w:vAlign w:val="center"/>
+            <w:tcMar>
+              <w:top w:w="65" w:type="dxa"/>
+              <w:left w:w="65" w:type="dxa"/>
+              <w:bottom w:w="65" w:type="dxa"/>
+              <w:right w:w="65" w:type="dxa"/>
+            </w:tcMar>
+          </w:tcPr>
+          <w:p>
+            <w:r>
+              <w:rPr>
+                <w:b/>
+              </w:rPr>
+              <w:t>Member</w:t>
+            </w:r>
+          </w:p>
+        </w:tc>
+        <w:tc>
+          <w:tcPr>
+            <w:tcW w:type="dxa" w:w="7776"/>
+            <w:vAlign w:val="center"/>
+            <w:tcMar>
+              <w:top w:w="65" w:type="dxa"/>
+              <w:left w:w="65" w:type="dxa"/>
+              <w:bottom w:w="65" w:type="dxa"/>
+              <w:right w:w="65" w:type="dxa"/>
+            </w:tcMar>
+          </w:tcPr>
+          <w:p>
+            <w:r>
+              <w:rPr>
+                <w:b/>
+              </w:rPr>
+              <w:t>Contribution area</w:t>
             </w:r>
           </w:p>
         </w:tc>
@@ -4932,35 +4938,35 @@
         </w:trPr>
         <w:tc>
           <w:tcPr>
-            <w:tcW w:type="dxa" w:w="2835"/>
-            <w:vAlign w:val="center"/>
-            <w:tcMar>
-              <w:top w:w="65" w:type="dxa"/>
-              <w:left w:w="65" w:type="dxa"/>
-              <w:bottom w:w="65" w:type="dxa"/>
-              <w:right w:w="65" w:type="dxa"/>
-            </w:tcMar>
-          </w:tcPr>
-          <w:p>
-            <w:r>
-              <w:t>All four team members</w:t>
-            </w:r>
-          </w:p>
-        </w:tc>
-        <w:tc>
-          <w:tcPr>
-            <w:tcW w:type="dxa" w:w="6236"/>
-            <w:vAlign w:val="center"/>
-            <w:tcMar>
-              <w:top w:w="65" w:type="dxa"/>
-              <w:left w:w="65" w:type="dxa"/>
-              <w:bottom w:w="65" w:type="dxa"/>
-              <w:right w:w="65" w:type="dxa"/>
-            </w:tcMar>
-          </w:tcPr>
-          <w:p>
-            <w:r>
-              <w:t>Shared work across architecture, infrastructure, platform implementation, policies and attacks, GitOps and rollouts, evaluation, documentation and presentation.</w:t>
+            <w:tcW w:type="dxa" w:w="2592"/>
+            <w:vAlign w:val="center"/>
+            <w:tcMar>
+              <w:top w:w="65" w:type="dxa"/>
+              <w:left w:w="65" w:type="dxa"/>
+              <w:bottom w:w="65" w:type="dxa"/>
+              <w:right w:w="65" w:type="dxa"/>
+            </w:tcMar>
+          </w:tcPr>
+          <w:p>
+            <w:r>
+              <w:t>Abhyuday Gupta</w:t>
+            </w:r>
+          </w:p>
+        </w:tc>
+        <w:tc>
+          <w:tcPr>
+            <w:tcW w:type="dxa" w:w="7776"/>
+            <w:vAlign w:val="center"/>
+            <w:tcMar>
+              <w:top w:w="65" w:type="dxa"/>
+              <w:left w:w="65" w:type="dxa"/>
+              <w:bottom w:w="65" w:type="dxa"/>
+              <w:right w:w="65" w:type="dxa"/>
+            </w:tcMar>
+          </w:tcPr>
+          <w:p>
+            <w:r>
+              <w:t>System architecture, trusted build workflow and CLI, cross-repository integration, and final evidence review</w:t>
             </w:r>
           </w:p>
         </w:tc>
@@ -4971,35 +4977,83 @@
         </w:trPr>
         <w:tc>
           <w:tcPr>
-            <w:tcW w:type="dxa" w:w="2835"/>
-            <w:vAlign w:val="center"/>
-            <w:tcMar>
-              <w:top w:w="65" w:type="dxa"/>
-              <w:left w:w="65" w:type="dxa"/>
-              <w:bottom w:w="65" w:type="dxa"/>
-              <w:right w:w="65" w:type="dxa"/>
-            </w:tcMar>
-          </w:tcPr>
-          <w:p>
-            <w:r>
-              <w:t>Abhyuday Gupta</w:t>
-            </w:r>
-          </w:p>
-        </w:tc>
-        <w:tc>
-          <w:tcPr>
-            <w:tcW w:type="dxa" w:w="6236"/>
-            <w:vAlign w:val="center"/>
-            <w:tcMar>
-              <w:top w:w="65" w:type="dxa"/>
-              <w:left w:w="65" w:type="dxa"/>
-              <w:bottom w:w="65" w:type="dxa"/>
-              <w:right w:w="65" w:type="dxa"/>
-            </w:tcMar>
-          </w:tcPr>
-          <w:p>
-            <w:r>
-              <w:t>Led architecture, core platform implementation, cross-repository integration, and final evidence review.</w:t>
+            <w:tcW w:type="dxa" w:w="2592"/>
+            <w:vAlign w:val="center"/>
+            <w:tcMar>
+              <w:top w:w="65" w:type="dxa"/>
+              <w:left w:w="65" w:type="dxa"/>
+              <w:bottom w:w="65" w:type="dxa"/>
+              <w:right w:w="65" w:type="dxa"/>
+            </w:tcMar>
+          </w:tcPr>
+          <w:p>
+            <w:r>
+              <w:t>Aditya Chetan Thakur</w:t>
+            </w:r>
+          </w:p>
+        </w:tc>
+        <w:tc>
+          <w:tcPr>
+            <w:tcW w:type="dxa" w:w="7776"/>
+            <w:vAlign w:val="center"/>
+            <w:tcMar>
+              <w:top w:w="65" w:type="dxa"/>
+              <w:left w:w="65" w:type="dxa"/>
+              <w:bottom w:w="65" w:type="dxa"/>
+              <w:right w:w="65" w:type="dxa"/>
+            </w:tcMar>
+          </w:tcPr>
+          <w:p>
+            <w:r>
+              <w:t>Azure and local infrastructure, Crossplane database path, and rebuild evaluation</w:t>
+            </w:r>
+          </w:p>
+        </w:tc>
+      </w:tr>
+      <w:tr>
+        <w:tc>
+          <w:tcPr>
+            <w:tcW w:type="dxa" w:w="2592"/>
+            <w:vAlign w:val="center"/>
+          </w:tcPr>
+          <w:p>
+            <w:r>
+              <w:t>Sankalp Arya</w:t>
+            </w:r>
+          </w:p>
+        </w:tc>
+        <w:tc>
+          <w:tcPr>
+            <w:tcW w:type="dxa" w:w="7776"/>
+            <w:vAlign w:val="center"/>
+          </w:tcPr>
+          <w:p>
+            <w:r>
+              <w:t>Admission policy design and readiness, attack suite, threat model, and upstream policy reports</w:t>
+            </w:r>
+          </w:p>
+        </w:tc>
+      </w:tr>
+      <w:tr>
+        <w:tc>
+          <w:tcPr>
+            <w:tcW w:type="dxa" w:w="2592"/>
+            <w:vAlign w:val="center"/>
+          </w:tcPr>
+          <w:p>
+            <w:r>
+              <w:t>Shaurya Jain</w:t>
+            </w:r>
+          </w:p>
+        </w:tc>
+        <w:tc>
+          <w:tcPr>
+            <w:tcW w:type="dxa" w:w="7776"/>
+            <w:vAlign w:val="center"/>
+          </w:tcPr>
+          <w:p>
+            <w:r>
+              <w:t>GitOps delivery configuration, rollout and observability validation, and presentation/demo preparation</w:t>
             </w:r>
           </w:p>
         </w:tc>

</xml_diff>

<commit_message>
Package final report and presentation (#7)
* docs: record Azure database validation findings

* docs: package final report and presentation

* docs: record fresh local rebuild results

* docs: record Azure PostgreSQL capability preflight

* docs: make teacher demo walkthrough repeatable

* docs: report team contributions collectively

* docs: align team contributions across report exports
</commit_message>
<xml_diff>
--- a/docs/report/Warden-Mini-Project-Report.docx
+++ b/docs/report/Warden-Mini-Project-Report.docx
@@ -1230,7 +1230,7 @@
           <w:i w:val="0"/>
           <w:sz w:val="22"/>
         </w:rPr>
-        <w:t>TEAM RESPONSIBILITIES</w:t>
+        <w:t>TEAM CONTRIBUTIONS</w:t>
         <w:tab/>
         <w:t>15</w:t>
       </w:r>
@@ -1285,11 +1285,7 @@
         <w:jc w:val="both"/>
       </w:pPr>
       <w:r>
-        <w:rPr>
-          <w:b w:val="0"/>
-          <w:i w:val="0"/>
-        </w:rPr>
-        <w:t>Warden brings service creation, software supply-chain checks, GitOps delivery, and automatic canary decisions into one Kubernetes platform. Five complete local trials created and deployed a service in a median of 8.6 minutes with no manual steps. In a separate 20-release canary experiment, all ten faulty releases aborted and all ten healthy releases promoted. Five successful Azure rebuilds demonstrated that the platform could be recreated from its recorded configuration.</w:t>
+        <w:t>We built Warden to bring service creation, software supply-chain checks, GitOps delivery, and automatic canary decisions into one Kubernetes platform. In five complete local trials, we created and deployed a service in a median of 8.6 minutes with no manual steps. In a separate 20-release canary experiment, all ten faulty releases aborted and all ten healthy releases promoted. We also completed five Azure rebuilds from recorded configuration.</w:t>
       </w:r>
     </w:p>
     <w:p>
@@ -1299,11 +1295,7 @@
         <w:jc w:val="both"/>
       </w:pPr>
       <w:r>
-        <w:rPr>
-          <w:b w:val="0"/>
-          <w:i w:val="0"/>
-        </w:rPr>
-        <w:t>These results address a practical engineering problem: a successful build does not by itself establish what will run in a cluster or how a faulty release will be contained. Warden links an image digest to its build evidence, promotes that digest through a controlled Git change, and evaluates the release under traffic. The four sample services, books, loans, members, and notify, provide repeatable workloads for testing this delivery path.</w:t>
+        <w:t>We addressed a practical engineering problem: a successful build does not by itself establish what will run in a cluster or how a faulty release will be contained. Warden links an image digest to its build evidence, promotes that digest through a controlled Git change, and evaluates the release under traffic. We used four deliberately small sample services, books, loans, members, and notify, to test this delivery path repeatedly.</w:t>
       </w:r>
     </w:p>
     <w:p>
@@ -1313,11 +1305,7 @@
         <w:jc w:val="both"/>
       </w:pPr>
       <w:r>
-        <w:rPr>
-          <w:b w:val="0"/>
-          <w:i w:val="0"/>
-        </w:rPr>
-        <w:t>The platform covers service creation, build and scanning, image signing, GitOps promotion, admission checks, progressive rollout, and a declarative PostgreSQL request. It runs locally on kind and was also rebuilt and measured on Azure Kubernetes Service (AKS). The same versioned configuration describes both environments.</w:t>
+        <w:t>Our platform covers service creation, build and scanning, image signing, GitOps promotion, admission checks, progressive rollout, and a declarative PostgreSQL request. We ran it locally on kind and rebuilt and measured it on Azure Kubernetes Service (AKS). The same versioned configuration describes both environments.</w:t>
       </w:r>
     </w:p>
     <w:p>
@@ -1336,11 +1324,7 @@
         <w:jc w:val="both"/>
       </w:pPr>
       <w:r>
-        <w:rPr>
-          <w:b w:val="0"/>
-          <w:i w:val="0"/>
-        </w:rPr>
-        <w:t>A valid image signature alone does not establish that the expected repository, branch, or workflow produced the image. Warden therefore checks the artifact digest and its build identity, while separating the pipeline from cluster credentials. The project set six measurable objectives:</w:t>
+        <w:t>A valid image signature alone does not establish that the expected repository, branch, or workflow produced an image. We therefore check the artifact digest and build identity, and keep the pipeline separate from cluster credentials. We set six measurable objectives:</w:t>
       </w:r>
     </w:p>
     <w:tbl>
@@ -1786,11 +1770,7 @@
         <w:jc w:val="both"/>
       </w:pPr>
       <w:r>
-        <w:rPr>
-          <w:b w:val="0"/>
-          <w:i w:val="0"/>
-        </w:rPr>
-        <w:t>AKS supplies managed Kubernetes; GitHub Actions runs the build; GitHub Container Registry stores immutable images; Microsoft Entra ID and GitHub OpenID Connect provide workload identity; Sigstore issues signing certificates and records transparency entries; Azure Storage holds encrypted OpenTofu state. Argo CD applies the GitOps repository, Argo Rollouts controls canary traffic, and Crossplane composes a CloudNativePG database. Together, these services cover compute, registry, identity, storage, infrastructure as code, and delivery automation.</w:t>
+        <w:t>We used AKS for managed Kubernetes; GitHub Actions for builds; GitHub Container Registry for immutable images; Microsoft Entra ID and GitHub OpenID Connect for workload identity; Sigstore for signing certificates and transparency entries; and Azure Storage for encrypted OpenTofu state. We used Argo CD for GitOps, Argo Rollouts for canaries, and Crossplane with CloudNativePG for databases. Together these services cover compute, registry, identity, storage, infrastructure as code, and delivery automation.</w:t>
       </w:r>
     </w:p>
     <w:p>
@@ -1800,11 +1780,7 @@
         <w:jc w:val="both"/>
       </w:pPr>
       <w:r>
-        <w:rPr>
-          <w:b w:val="0"/>
-          <w:i w:val="0"/>
-        </w:rPr>
-        <w:t>The implemented scope includes enforceable digest, registry, and Pod hygiene rules, a tested cryptographic policy in Audit, and self-service databases through CloudNativePG. Azure Flexible Server support is implemented on review branches but still needs a live provisioning and lifecycle test. Chapter 3 distinguishes controlled Deny-mode tests from installed enforcement. The evaluation also excludes production availability, multiple regions, and runtime intrusion detection.</w:t>
+        <w:t>We implemented enforceable digest, registry, and Pod-hygiene rules, a cryptographic policy tested in Audit, and self-service databases through CloudNativePG. Azure Flexible Server support is in open review PRs and still needs a live provisioning and lifecycle test. In Chapter 3, we distinguish controlled Deny-mode tests from installed enforcement. We did not evaluate production availability, multiple regions, or runtime intrusion detection.</w:t>
       </w:r>
     </w:p>
     <w:p>
@@ -1823,11 +1799,7 @@
         <w:jc w:val="both"/>
       </w:pPr>
       <w:r>
-        <w:rPr>
-          <w:b w:val="0"/>
-          <w:i w:val="0"/>
-        </w:rPr>
-        <w:t>The platform connects several established ideas. Borg illustrates declarative workload management and automated recovery in a shared cluster. The in-toto work treats software integrity as a property of the steps that produce an artifact. Sigstore makes artifact signing practical through identity-backed certificates, short-lived keys, and public transparency records. SLSA defines interoperable provenance for describing where, when, and how an artifact was built. Warden applies these ideas through Kubernetes orchestration and signed build provenance. [1], [2], [3], [4]</w:t>
+        <w:t>We drew on several established ideas. Borg illustrates declarative workload management and automated recovery in a shared cluster. The in-toto work treats software integrity as a property of the steps that produce an artifact. Sigstore makes artifact signing practical through identity-backed certificates, short-lived keys, and public transparency records. SLSA defines interoperable provenance for describing where, when, and how an artifact was built. We apply these ideas through Kubernetes orchestration and signed build provenance. [1], [2], [3], [4]</w:t>
       </w:r>
     </w:p>
     <w:p>
@@ -1837,11 +1809,7 @@
         <w:jc w:val="both"/>
       </w:pPr>
       <w:r>
-        <w:rPr>
-          <w:b w:val="0"/>
-          <w:i w:val="0"/>
-        </w:rPr>
-        <w:t>OpenGitOps describes desired state that is versioned, pulled automatically, and continuously reconciled. Google's canary-release guidance explains how partial deployments and observed behavior can inform a rollout decision. DORA provides a framework for measuring delivery throughput and instability. These sources supply the technical foundations for Warden's GitOps path, canary experiments, and delivery measurements. [5], [6], [7]</w:t>
+        <w:t>We also drew on OpenGitOps principles for versioned desired state and continuous pull-based reconciliation. Google's canary-release guidance informed our partial deployment and rollout decisions. We used DORA to measure delivery throughput and instability. These sources informed our GitOps path, canary experiments, and delivery measurements. [5], [6], [7]</w:t>
       </w:r>
     </w:p>
     <w:p>
@@ -1860,11 +1828,7 @@
         <w:jc w:val="both"/>
       </w:pPr>
       <w:r>
-        <w:rPr>
-          <w:b w:val="0"/>
-          <w:i w:val="0"/>
-        </w:rPr>
-        <w:t>The engineering contribution is the integration and evaluation of the complete delivery path. The project supplies a service-creation CLI, a reusable build and signing workflow, constrained promotion, policy fixtures, experiment runners, and delivery-metric calculations. Its evaluation reaches beyond a successful deployment: it attempts invalid artifacts, injects faults, checks controller reconciliation, and recreates the environment. This makes both the working behavior and the remaining gaps inspectable.</w:t>
+        <w:t>Our engineering contribution is the integration and evaluation of a complete delivery path. We built a service-creation CLI, a reusable build and signing workflow, constrained promotion, policy fixtures, experiment runners, and delivery-metric calculations. We tested invalid artifacts, injected faults, checked controller reconciliation, and rebuilt the environment. This let us inspect both working behavior and remaining gaps.</w:t>
       </w:r>
     </w:p>
     <w:p>
@@ -1948,11 +1912,7 @@
         <w:jc w:val="both"/>
       </w:pPr>
       <w:r>
-        <w:rPr>
-          <w:b w:val="0"/>
-          <w:i w:val="0"/>
-        </w:rPr>
-        <w:t>The project separates infrastructure, GitOps state, admission policies, and platform tooling into four repositories. OpenTofu prepares Azure resources. For local trials, a kind cluster replaces AKS while the GitOps and admission paths stay comparable. Pinned component versions and image digests keep rebuilds repeatable. Cluster creation and destruction were timed from a clean state, and failed attempts remain in the measurement records.</w:t>
+        <w:t>We separated infrastructure, GitOps state, admission policies, and platform tooling into four repositories. We use OpenTofu to prepare Azure resources. For local trials, we use kind in place of AKS while keeping the GitOps and admission paths comparable. Pinned component versions and image digests make our rebuilds repeatable. We timed cluster creation and destruction from a clean state, and retained failed attempts in the measurement records.</w:t>
       </w:r>
     </w:p>
     <w:p>
@@ -1971,11 +1931,7 @@
         <w:jc w:val="both"/>
       </w:pPr>
       <w:r>
-        <w:rPr>
-          <w:b w:val="0"/>
-          <w:i w:val="0"/>
-        </w:rPr>
-        <w:t>The Warden command creates a service repository, a small application, a reusable delivery workflow, deployment manifests, and a catalog entry. A push calls the shared platform workflow. It builds and scans the image, signs the digest, attaches provenance, and opens a narrow GitOps pull request that changes the deployed digest. The signing job alone receives an identity token. No delivery job receives cluster credentials; Argo CD later pulls the merged change. Third-party workflow actions are pinned to full commit hashes. The artifact identity and production steps follow software supply-chain practices described by in-toto and Sigstore [2], [3].</w:t>
+        <w:t>Our warden new command creates a service repository, a small application, a reusable delivery workflow, deployment manifests, and a catalog entry. A push calls our shared platform workflow, which builds and scans the image, signs its digest, attaches provenance, and opens a narrow GitOps pull request that changes the deployed digest. Only the signing job receives an identity token. No delivery job receives cluster credentials; Argo CD pulls the merged change. We pin third-party workflow actions to full commit hashes. Our artifact identity and production steps follow software supply-chain practices described by in-toto and Sigstore [2], [3].</w:t>
       </w:r>
     </w:p>
     <w:p>
@@ -1999,11 +1955,7 @@
         <w:jc w:val="both"/>
       </w:pPr>
       <w:r>
-        <w:rPr>
-          <w:b w:val="0"/>
-          <w:i w:val="0"/>
-        </w:rPr>
-        <w:t>A required digest-only check constrains each promotion pull request to one image digest. The promoter application can merge after that check passes. Argo CD applies the desired state. Native admission rules reject mutable tags, unapproved registries, and unsafe Pod settings. Kyverno verifies signatures and provenance against the intended build identity in Audit mode. For the controlled attack experiment, the same policy was exercised in Deny mode. Argo Rollouts then sends a small traffic share to the new version and uses Prometheus metrics to promote or abort it. Envoy Gateway supplies the route. Pull-based reconciliation and partial rollouts follow the GitOps and canary principles in [5] and [6].</w:t>
+        <w:t>We require each promotion pull request to pass a digest-only check that permits one image-digest change. After that check passes, our promoter application can merge the change. Argo CD applies the desired state. Our native admission rules reject mutable tags, unapproved registries, and unsafe Pod settings. Kyverno checks signatures and provenance against the intended build identity in Audit mode. For our controlled attack experiment, we exercised the same policy in Deny mode. Argo Rollouts then shifts a small share of traffic to the new version and uses Prometheus metrics to promote or abort it. Envoy Gateway supplies the route. Our pull-based reconciliation and partial rollouts follow GitOps and canary principles [5], [6].</w:t>
       </w:r>
     </w:p>
     <w:p>
@@ -2022,11 +1974,7 @@
         <w:jc w:val="both"/>
       </w:pPr>
       <w:r>
-        <w:rPr>
-          <w:b w:val="0"/>
-          <w:i w:val="0"/>
-        </w:rPr>
-        <w:t>The repositories separate the code that builds an application from the configuration that approves and deploys it. A service repository cannot directly rewrite the policy repository through its promotion credential. The build job cannot request a signing identity token; that permission belongs only to the signing job, which does not check out project code. This separation reduces the credentials available to application build scripts. The GitOps check also rejects a changed image name or an unrelated configuration edit.</w:t>
+        <w:t>We separated the repositories that build applications from the configuration that approves and deploys them. A service repository cannot rewrite the policy repository using its promotion credential. The build job cannot request a signing identity token; only the signing job has that permission, and it does not check out project code. This limits the credentials available to application build scripts. Our GitOps check also rejects a changed image name or an unrelated configuration edit.</w:t>
       </w:r>
     </w:p>
     <w:tbl>
@@ -2568,11 +2516,7 @@
         <w:jc w:val="both"/>
       </w:pPr>
       <w:r>
-        <w:rPr>
-          <w:b w:val="0"/>
-          <w:i w:val="0"/>
-        </w:rPr>
-        <w:t>A namespaced database request is reconciled by Crossplane and CloudNativePG. The composition creates a predictable connection Secret, allowing the application manifest to remain the same across kind and AKS. Database readiness and a client connection were recorded. Delivery metrics use deployment events rather than a transient cluster log. Attack outcomes, canary timing, rebuilds, and verification latency were retained with their experiment records.</w:t>
+        <w:t>We expose a namespaced database request through Crossplane and CloudNativePG. The composition creates a predictable connection Secret, so an application manifest can remain the same across kind and AKS. We recorded database readiness and a client connection. We compute delivery metrics from deployment events rather than transient cluster logs, and retain attack outcomes, canary timing, rebuilds, and verification latency with their experiment records.</w:t>
       </w:r>
     </w:p>
     <w:p>
@@ -2591,11 +2535,7 @@
         <w:jc w:val="both"/>
       </w:pPr>
       <w:r>
-        <w:rPr>
-          <w:b w:val="0"/>
-          <w:i w:val="0"/>
-        </w:rPr>
-        <w:t>The rollout advances through 5%, 25%, and 50% canary traffic before full promotion. A synthetic load supplies requests while Prometheus evaluates success rate and latency. The experiments inject either HTTP errors or extra latency, so both reliability and response time are tested. An unsuccessful analysis aborts the canary; a subsequent corrected release still passes through the normal build and promotion path. The report distinguishes time to abort from time to deploy a complete fix, following the canary approach described in [6].</w:t>
+        <w:t>We configure the rollout to advance through 5%, 25%, and 50% canary traffic before full promotion. Synthetic load supplies requests while Prometheus evaluates success rate and latency. We injected HTTP errors or extra latency to test both reliability and response time. An unsuccessful analysis aborts the canary, and a corrected release still passes through our normal build and promotion path. We distinguish time to abort from time to deploy a complete fix, following the canary approach described in [6].</w:t>
       </w:r>
     </w:p>
     <w:p>
@@ -2605,11 +2545,7 @@
         <w:jc w:val="both"/>
       </w:pPr>
       <w:r>
-        <w:rPr>
-          <w:b w:val="0"/>
-          <w:i w:val="0"/>
-        </w:rPr>
-        <w:t>Traffic routing required coordination between two controllers. Argo CD maintains the declared configuration, while Argo Rollouts must change route weights during a canary. Without an explicit field-ownership exception, reconciliation reset those weights and invalidated the intended experiment. The final configuration permits Rollouts to manage the traffic weights while Argo CD continues to reconcile the surrounding resource.</w:t>
+        <w:t>We had to coordinate two controllers that manage traffic routing. Argo CD maintains the declared configuration, while Argo Rollouts changes route weights during a canary. Without an explicit field-ownership exception, reconciliation reset those weights and invalidated the experiment. Our final configuration lets Rollouts manage traffic weights while Argo CD reconciles the surrounding resource.</w:t>
       </w:r>
     </w:p>
     <w:p>
@@ -2628,11 +2564,7 @@
         <w:jc w:val="both"/>
       </w:pPr>
       <w:r>
-        <w:rPr>
-          <w:b w:val="0"/>
-          <w:i w:val="0"/>
-        </w:rPr>
-        <w:t>Eight experiments cover service creation, security controls, canary behavior, database provisioning, delivery history, rebuilds, comparison with another platform, and verification overhead. Each stores the observation alongside its procedure. Successful rebuilds are summarized separately from failed attempts; a failed attempt remains in the measurement records. Release metrics are cross-checked against the experiment runner so that an incorrect event count does not become a performance claim. Metric definitions follow DORA's five measures of delivery performance [6].</w:t>
+        <w:t>We ran eight experiments covering service creation, security controls, canary behavior, database provisioning, delivery history, rebuilds, comparison with another platform, and verification overhead. We stored each observation with its procedure. We summarize successful rebuilds separately from failed attempts and retain the failures in the measurement records. We cross-check release metrics against the experiment runner so an incorrect event count does not become a performance claim. Our metric definitions follow DORA's five measures of delivery performance [6].</w:t>
       </w:r>
     </w:p>
     <w:p>
@@ -2642,11 +2574,7 @@
         <w:jc w:val="both"/>
       </w:pPr>
       <w:r>
-        <w:rPr>
-          <w:b w:val="0"/>
-          <w:i w:val="0"/>
-        </w:rPr>
-        <w:t>The environments answer different questions. kind makes repeated local trials affordable, while AKS tests cloud provisioning, reconciliation, and the policy path on managed Kubernetes. Results are labeled by environment because one successful local series does not establish identical cloud behavior. Small samples and deliberate fault injection limit the conclusions: the experiments demonstrate the recorded behavior, not a production reliability rate.</w:t>
+        <w:t>We used kind for affordable repeated local trials and AKS to test cloud provisioning, reconciliation, and policy behavior on managed Kubernetes. We label results by environment because a successful local series does not establish identical cloud behavior. Our small samples and deliberate fault injection limit the conclusions: these experiments demonstrate the recorded behavior, not a production reliability rate.</w:t>
       </w:r>
     </w:p>
     <w:p>
@@ -3437,11 +3365,7 @@
         <w:jc w:val="both"/>
       </w:pPr>
       <w:r>
-        <w:rPr>
-          <w:b w:val="0"/>
-          <w:i w:val="0"/>
-        </w:rPr>
-        <w:t>The five complete service-creation runs finished below the 15-minute target. The resumed books run is excluded from this sample. The result demonstrates the automated local path, while the planned Azure series and hand-timed baseline remain open.</w:t>
+        <w:t>Our five complete service-creation runs finished below the 15-minute target. We excluded the resumed books run from this sample. These results demonstrate our automated local path; our planned Azure series and hand-timed baseline remain open.</w:t>
       </w:r>
     </w:p>
     <w:p>
@@ -3516,11 +3440,7 @@
         <w:jc w:val="both"/>
       </w:pPr>
       <w:r>
-        <w:rPr>
-          <w:b w:val="0"/>
-          <w:i w:val="0"/>
-        </w:rPr>
-        <w:t>The controlled rollout series contained ten deliberately faulty and ten healthy releases. Every faulty release aborted, and every healthy release promoted. The median time from rollout start to abort was 147.2 seconds; the healthy promotion median was 471.6 seconds. The error trials exposed a median 0.397% of requests to the faulty canary, below the planned 0.5% share. The run data supports the rollback claim for kind; no comparable Azure canary series was run.</w:t>
+        <w:t>In our controlled rollout series, we tested ten deliberately faulty and ten healthy releases. All faulty releases aborted, and all healthy releases promoted. The median time from rollout start to abort was 147.2 seconds; the healthy promotion median was 471.6 seconds. The error trials exposed a median 0.397% of requests to the faulty canary, below the planned 0.5% share. These runs support the rollback claim for kind; we did not run a comparable Azure canary series.</w:t>
       </w:r>
     </w:p>
     <w:p>
@@ -3581,11 +3501,7 @@
         <w:jc w:val="both"/>
       </w:pPr>
       <w:r>
-        <w:rPr>
-          <w:b w:val="0"/>
-          <w:i w:val="0"/>
-        </w:rPr>
-        <w:t>The ten faulty trials comprise five error and five latency injections. In the error trials, the observed request failure share ranged from 0.325% to 0.509%; its median was 0.397%. The latency trials slowed a median 4.08% of service requests and produced no HTTP errors. These measures describe different failure modes and should not be combined into one success percentage.</w:t>
+        <w:t>We split the ten faulty trials between five error and five latency injections. In the error trials, the observed request failure share ranged from 0.325% to 0.509%; its median was 0.397%. The latency trials slowed a median 4.08% of service requests and produced no HTTP errors. We report these measures separately because they describe different failure modes.</w:t>
       </w:r>
     </w:p>
     <w:p>
@@ -3595,11 +3511,7 @@
         <w:jc w:val="both"/>
       </w:pPr>
       <w:r>
-        <w:rPr>
-          <w:b w:val="0"/>
-          <w:i w:val="0"/>
-        </w:rPr>
-        <w:t>A quick abort also differs from complete recovery. The median interval from abort to a corrected release being fully promoted was 759.2 seconds, including the new build and canary. A single healthy trial took 1,209.5 seconds to promote, while the other healthy trials took 466.2–474.1 seconds. Keeping that outlier visible shows the spread that a median alone would hide.</w:t>
+        <w:t>We distinguish a quick abort from complete recovery. The median interval from abort to a corrected release being fully promoted was 759.2 seconds, including the new build and canary. One healthy trial took 1,209.5 seconds to promote; the other healthy trials took 466.2–474.1 seconds. We retain that outlier because the median alone would hide the spread.</w:t>
       </w:r>
     </w:p>
     <w:p>
@@ -3623,11 +3535,7 @@
         <w:jc w:val="both"/>
       </w:pPr>
       <w:r>
-        <w:rPr>
-          <w:b w:val="0"/>
-          <w:i w:val="0"/>
-        </w:rPr>
-        <w:t>The original 2026-10-26 E5 batch used owner merges after the digest-only check. Its 20% failure rate was planned and its lead time excluded human review. The separate 2026-10-27 app-only repeat records 20 deployments, five per service, with 16 successful and four injected-fault deployments. The promoter app merged every promotion after the required digest-only check, without an owner merge. Median change lead time was 12.5 minutes, change fail and rework rates were 20%, and median failed-deployment recovery was 12.6 minutes. The short synthetic batch does not describe normal team delivery frequency.</w:t>
+        <w:t>We ran two E5 batches. In the original 2026-10-26 batch, we used owner merges after the digest-only check. We planned its 20% failure rate, and its lead time excludes human review. Our separate 2026-10-27 app-only repeat records 20 deployments, five per service, with 16 successful and four injected-fault deployments. The promoter app merged each promotion after the required digest-only check, without an owner merge. Median change lead time was 12.5 minutes, change fail and rework rates were 20%, and median failed-deployment recovery was 12.6 minutes. This short synthetic batch does not represent normal team delivery frequency.</w:t>
       </w:r>
     </w:p>
     <w:p>
@@ -3637,11 +3545,7 @@
         <w:jc w:val="both"/>
       </w:pPr>
       <w:r>
-        <w:rPr>
-          <w:b w:val="0"/>
-          <w:i w:val="0"/>
-        </w:rPr>
-        <w:t>The canary records for the app-only repeat show 12 healthy promotions and four injected-error releases aborted by the success-rate analysis, each followed by a healthy fix. Fault aborts took a median 147.6 seconds, with 0.39% of requests failing during the canary at a 5% traffic share. Abort-to-fixed median was 756.6 seconds. One members CI capture timed out and a second healthy attempt overlapped the members fault test; both are retained as excluded records. The 20 deployments in the GitHub ledger agree with the measured set.</w:t>
+        <w:t>Our canary records for the app-only repeat show 12 healthy promotions and four injected-error releases aborted by the success-rate analysis, each followed by a healthy fix. Fault aborts took a median 147.6 seconds, with 0.39% of requests failing during the canary at a 5% traffic share. Abort-to-fixed median was 756.6 seconds. We retained one timed-out members CI capture and one healthy attempt that overlapped the members fault test as excluded records. The 20 deployments in the GitHub ledger agree with our measured set.</w:t>
       </w:r>
     </w:p>
     <w:tbl>
@@ -4341,11 +4245,7 @@
         <w:jc w:val="both"/>
       </w:pPr>
       <w:r>
-        <w:rPr>
-          <w:b w:val="0"/>
-          <w:i w:val="0"/>
-        </w:rPr>
-        <w:t>The resulting deployment frequency, about 250 per day in this short test window, describes the scripted batch and is not a useful estimate of normal team cadence.</w:t>
+        <w:t>Our calculated deployment frequency is about 250 per day in this short test window. We do not interpret that scripted rate as normal team cadence.</w:t>
       </w:r>
     </w:p>
     <w:tbl>
@@ -4793,11 +4693,7 @@
         <w:jc w:val="both"/>
       </w:pPr>
       <w:r>
-        <w:rPr>
-          <w:b w:val="0"/>
-          <w:i w:val="0"/>
-        </w:rPr>
-        <w:t>Local rebuilds succeeded in 11 of 12 recorded runs, with a median of 14.9 minutes and a 24.2-minute 90th percentile. Five Azure rebuilds succeeded from an empty state with a median of 22 minutes. Four failed Azure attempts remain in the measurement records and were analyzed rather than discarded.</w:t>
+        <w:t>We recorded 12 successful local rebuilds out of 13, with a median of 887.5 seconds (14.8 minutes), a 24.2-minute 90th percentile, and a range of 404 to 1,583 seconds. The latest fresh-cluster rehearsal took 869 seconds; all 23 Argo CD applications were Synced and Healthy, and all four services returned HTTP 200. Its ledger marks the worktrees dirty because untracked local instruction files were present; we report our earlier clean-commit rebuild series separately. We also completed five Azure rebuilds from an empty state with a median of 22 minutes. We retained and analyzed four failed Azure attempts.</w:t>
       </w:r>
     </w:p>
     <w:p>
@@ -4816,11 +4712,7 @@
         <w:jc w:val="both"/>
       </w:pPr>
       <w:r>
-        <w:rPr>
-          <w:b w:val="0"/>
-          <w:i w:val="0"/>
-        </w:rPr>
-        <w:t>All 15 checks passed on kind and AKS, but they do not represent 15 admission rejections. The suite contains one admitted positive control, eight direct admission denials, one ReplicaSet case whose child Pods were refused, and five checks covering earlier prevention, credential absence, signing permissions, promotion constraints, and drift recovery. In the drift test, the policy was restored after 1.4 seconds on kind and 1.6 seconds on AKS.</w:t>
+        <w:t>Our attack suite passed all 15 checks on kind and AKS, but those results do not represent 15 admission rejections. The suite includes one admitted positive control, eight direct admission denials, one ReplicaSet case whose child Pods were refused, and five checks covering earlier prevention, credential absence, signing permissions, promotion constraints, and drift recovery. In the drift test, we restored the policy after 1.4 seconds on kind and 1.6 seconds on AKS.</w:t>
       </w:r>
     </w:p>
     <w:p>
@@ -4830,11 +4722,7 @@
         <w:jc w:val="both"/>
       </w:pPr>
       <w:r>
-        <w:rPr>
-          <w:b w:val="0"/>
-          <w:i w:val="0"/>
-        </w:rPr>
-        <w:t>This gives evidence for controls at several points in the delivery path. It does not establish fail-closed operation of the installed image policy, which remains in Audit. Warm verification added about 14–15 seconds per Pod, and transient registry or TUF fetch errors interrupted some legitimate checks. A new readiness run is required before enforcement changes.</w:t>
+        <w:t>These results show controls at several points in our delivery path. They do not establish fail-closed operation of the installed image policy, which remains in Audit. Warm verification added about 14–15 seconds per Pod, and transient registry or TUF fetch errors interrupted some legitimate checks. We need another readiness run before changing enforcement.</w:t>
       </w:r>
     </w:p>
     <w:p>
@@ -4844,11 +4732,7 @@
         <w:jc w:val="both"/>
       </w:pPr>
       <w:r>
-        <w:rPr>
-          <w:b w:val="0"/>
-          <w:i w:val="0"/>
-        </w:rPr>
-        <w:t>The measured database request worked in both environments and generated a usable connection URI, with CloudNativePG selected on kind and AKS. Azure Flexible Server support is now implemented in draft infrastructure and GitOps pull requests but has not been merged or tested live. The result establishes portability of the request and Secret contract across clusters, not yet across database providers.</w:t>
+        <w:t>Our measured database request worked in both environments and generated a usable connection URI; we used CloudNativePG on kind and AKS. Azure Flexible Server support is implemented in open infrastructure and GitOps pull requests but has not been merged or tested live. Our results establish portability of the request and Secret contract across clusters, not yet across database providers.</w:t>
       </w:r>
     </w:p>
     <w:p>
@@ -4872,11 +4756,7 @@
         <w:jc w:val="both"/>
       </w:pPr>
       <w:r>
-        <w:rPr>
-          <w:b w:val="0"/>
-          <w:i w:val="0"/>
-        </w:rPr>
-        <w:t>The idpbuilder comparison helps explain Warden's resource cost. In one recorded run, idpbuilder reached GitOps and a first application in 8.5 minutes using 2.2 GiB. Warden's recorded platform footprint was 8.8 GiB and included admission checks, canary analysis, observability, and database infrastructure. The bootstrap paths differed: the baseline deployed a pre-built public image, while Warden's service-creation experiment included repository creation, building, signing, and promotion. The comparison describes scope and resource use; it is not an equal-feature speed benchmark.</w:t>
+        <w:t>We compared Warden with idpbuilder to understand the platform resource cost. In one recorded run, idpbuilder reached GitOps and a first application in 8.5 minutes using 2.2 GiB. Our recorded platform footprint was 8.8 GiB and included admission checks, canary analysis, observability, and database infrastructure. The bootstrap paths differed: the baseline deployed a pre-built public image, while our service-creation experiment included repository creation, building, signing, and promotion. This comparison describes scope and resource use; it is not an equal-feature speed benchmark.</w:t>
       </w:r>
     </w:p>
     <w:p>
@@ -4895,11 +4775,7 @@
         <w:jc w:val="both"/>
       </w:pPr>
       <w:r>
-        <w:rPr>
-          <w:b w:val="0"/>
-          <w:i w:val="0"/>
-        </w:rPr>
-        <w:t>Several results depended on resolving interactions between components. The first promotion fix failed because the command-line client refused a blocked pull request before the server could apply the promoter's review bypass. Calling the merge endpoint with the expected head commit resolved that path; the digest-only check remained mandatory. The four later service releases provide direct evidence that the revised path worked.</w:t>
+        <w:t>We had to resolve interactions between components to make several results possible. Our first promotion fix failed because the command-line client refused a blocked pull request before the server could apply the promoter's review bypass. Calling the merge endpoint with the expected head commit resolved the path while keeping the digest-only check mandatory. The four later service releases provide direct evidence that the revised path worked.</w:t>
       </w:r>
     </w:p>
     <w:p>
@@ -4909,11 +4785,7 @@
         <w:jc w:val="both"/>
       </w:pPr>
       <w:r>
-        <w:rPr>
-          <w:b w:val="0"/>
-          <w:i w:val="0"/>
-        </w:rPr>
-        <w:t>Measurement code also needed validation. An early delivery-metric calculation counted only eight of twenty releases because older GitHub deployments became inactive and reconciliation announced a revision across multiple applications. Cross-checking the event ledger against the experiment runner exposed both errors. The corrected result counts twenty releases and four injected failures.</w:t>
+        <w:t>We also validated our measurement code. An early delivery-metric calculation counted only eight of twenty releases because older GitHub deployments became inactive and reconciliation announced a revision across multiple applications. We compared the event ledger against the experiment runner and found both errors. Our corrected result counts twenty releases and four injected failures.</w:t>
       </w:r>
     </w:p>
     <w:p>
@@ -4923,11 +4795,7 @@
         <w:jc w:val="both"/>
       </w:pPr>
       <w:r>
-        <w:rPr>
-          <w:b w:val="0"/>
-          <w:i w:val="0"/>
-        </w:rPr>
-        <w:t>Database integration exposed another issue: operator-created Pods and initialization Jobs need narrowly scoped admission exceptions. A rule that looked acceptable in Audit could have blocked the database in Deny. Testing legitimate workload classes alongside attacks was necessary to judge the policy. The experiments also exposed controller and measurement problems that a successful deployment alone would not have found.</w:t>
+        <w:t>We found another admission issue during database integration: operator-created Pods and initialization Jobs need narrowly scoped exceptions. A rule that appeared acceptable in Audit could have blocked every database in Deny mode. We tested legitimate workload classes alongside attacks to evaluate the policy. These experiments also exposed controller and measurement problems that a successful deployment alone would not have revealed.</w:t>
       </w:r>
     </w:p>
     <w:p>
@@ -4951,11 +4819,7 @@
         <w:jc w:val="both"/>
       </w:pPr>
       <w:r>
-        <w:rPr>
-          <w:b w:val="0"/>
-          <w:i w:val="0"/>
-        </w:rPr>
-        <w:t>Warden demonstrates a working Kubernetes delivery platform whose key behaviors can be traced to recorded experiments. It combines service scaffolding, an isolated signing workflow, digest promotion, admission controls, canary analysis, database requests, and repeatable infrastructure. The local service-creation median was 8.6 minutes; the app-only canary batch aborted all four injected faults and promoted all 12 measured healthy releases; and five Azure rebuilds recreated the platform with a median duration of about 22 minutes. These outcomes show an integrated system that was exercised beyond a single successful deployment.</w:t>
+        <w:t>We demonstrated a working Kubernetes delivery platform whose key behaviors are traceable to recorded experiments. Our platform combines service scaffolding, an isolated signing workflow, digest promotion, admission controls, canary analysis, database requests, and repeatable infrastructure. We measured a local service-creation median of 8.6 minutes; in the app-only canary batch, all four injected faults aborted and all 12 measured healthy releases promoted; five Azure rebuilds recreated the platform in a median of about 22 minutes. We exercised the system beyond a single successful deployment.</w:t>
       </w:r>
     </w:p>
     <w:p>
@@ -4965,11 +4829,7 @@
         <w:jc w:val="both"/>
       </w:pPr>
       <w:r>
-        <w:rPr>
-          <w:b w:val="0"/>
-          <w:i w:val="0"/>
-        </w:rPr>
-        <w:t>Two promised outcomes need more work before they can be described as complete. The installed cryptographic admission policy still audits instead of denying, even though a controlled Deny-mode suite passed. Azure Flexible Server code is staged for review and still needs a live test. The E1 sample is also smaller than planned. These boundaries distinguish a tested feature from a production-ready path.</w:t>
+        <w:t>We still need more work before claiming two promised outcomes are complete. Our installed cryptographic admission policy remains in Audit, even though a controlled Deny-mode suite passed. The Azure Flexible Server code is in review and still needs a live test. Our E1 sample is also smaller than planned. These limits separate features we tested from paths that are ready for production.</w:t>
       </w:r>
     </w:p>
     <w:p>
@@ -4979,11 +4839,7 @@
         <w:jc w:val="both"/>
       </w:pPr>
       <w:r>
-        <w:rPr>
-          <w:b w:val="0"/>
-          <w:i w:val="0"/>
-        </w:rPr>
-        <w:t>The next engineering steps are to remeasure image verification after a Kyverno fix, including legitimate Pods, registry failures, and timeout behavior before changing Audit to Deny; review and merge the Azure database changes, then test connection, deletion, and teardown; and expand service-creation and canary measurements on AKS. The report preserves what has been demonstrated and the evidence still needed for those claims.</w:t>
+        <w:t>Our next steps are to remeasure image verification after a Kyverno fix, including legitimate Pods, registry failures, and timeout behavior before changing Audit to Deny; review and merge the Azure database changes, then test connection, deletion, and teardown; and expand our service-creation and canary measurements on AKS. We preserve the evidence for completed claims and identify the additional evidence these claims still need.</w:t>
       </w:r>
     </w:p>
     <w:p>
@@ -4997,7 +4853,7 @@
         <w:spacing w:before="220" w:after="100"/>
       </w:pPr>
       <w:r>
-        <w:t>TEAM RESPONSIBILITIES</w:t>
+        <w:t>TEAM CONTRIBUTIONS</w:t>
       </w:r>
     </w:p>
     <w:p>
@@ -5007,11 +4863,7 @@
         <w:jc w:val="both"/>
       </w:pPr>
       <w:r>
-        <w:rPr>
-          <w:b w:val="0"/>
-          <w:i w:val="0"/>
-        </w:rPr>
-        <w:t>The table records the project plan's responsibility allocation. Each member should confirm that the assigned area reflects work they personally completed before submission.</w:t>
+        <w:t>We completed Warden as a four-person team. Our main contribution areas were:</w:t>
       </w:r>
     </w:p>
     <w:tbl>
@@ -5031,8 +4883,8 @@
         </w:tblBorders>
       </w:tblPr>
       <w:tblGrid>
-        <w:gridCol w:w="2835"/>
-        <w:gridCol w:w="6236"/>
+        <w:gridCol w:w="2592"/>
+        <w:gridCol w:w="7776"/>
       </w:tblGrid>
       <w:tr>
         <w:trPr>
@@ -5041,24 +4893,19 @@
         </w:trPr>
         <w:tc>
           <w:tcPr>
-            <w:tcW w:type="dxa" w:w="2835"/>
-            <w:vAlign w:val="center"/>
-            <w:tcMar>
-              <w:top w:w="65" w:type="dxa"/>
-              <w:left w:w="65" w:type="dxa"/>
-              <w:bottom w:w="65" w:type="dxa"/>
-              <w:right w:w="65" w:type="dxa"/>
-            </w:tcMar>
-          </w:tcPr>
-          <w:p>
-            <w:pPr>
-              <w:spacing w:after="0"/>
-            </w:pPr>
-            <w:r>
-              <w:rPr>
-                <w:rFonts w:ascii="Times New Roman" w:hAnsi="Times New Roman"/>
+            <w:tcW w:type="dxa" w:w="2592"/>
+            <w:vAlign w:val="center"/>
+            <w:tcMar>
+              <w:top w:w="65" w:type="dxa"/>
+              <w:left w:w="65" w:type="dxa"/>
+              <w:bottom w:w="65" w:type="dxa"/>
+              <w:right w:w="65" w:type="dxa"/>
+            </w:tcMar>
+          </w:tcPr>
+          <w:p>
+            <w:r>
+              <w:rPr>
                 <w:b/>
-                <w:sz w:val="20"/>
               </w:rPr>
               <w:t>Member</w:t>
             </w:r>
@@ -5066,26 +4913,21 @@
         </w:tc>
         <w:tc>
           <w:tcPr>
-            <w:tcW w:type="dxa" w:w="6236"/>
-            <w:vAlign w:val="center"/>
-            <w:tcMar>
-              <w:top w:w="65" w:type="dxa"/>
-              <w:left w:w="65" w:type="dxa"/>
-              <w:bottom w:w="65" w:type="dxa"/>
-              <w:right w:w="65" w:type="dxa"/>
-            </w:tcMar>
-          </w:tcPr>
-          <w:p>
-            <w:pPr>
-              <w:spacing w:after="0"/>
-            </w:pPr>
-            <w:r>
-              <w:rPr>
-                <w:rFonts w:ascii="Times New Roman" w:hAnsi="Times New Roman"/>
+            <w:tcW w:type="dxa" w:w="7776"/>
+            <w:vAlign w:val="center"/>
+            <w:tcMar>
+              <w:top w:w="65" w:type="dxa"/>
+              <w:left w:w="65" w:type="dxa"/>
+              <w:bottom w:w="65" w:type="dxa"/>
+              <w:right w:w="65" w:type="dxa"/>
+            </w:tcMar>
+          </w:tcPr>
+          <w:p>
+            <w:r>
+              <w:rPr>
                 <w:b/>
-                <w:sz w:val="20"/>
-              </w:rPr>
-              <w:t>Assigned area</w:t>
+              </w:rPr>
+              <w:t>Contribution area</w:t>
             </w:r>
           </w:p>
         </w:tc>
@@ -5096,51 +4938,35 @@
         </w:trPr>
         <w:tc>
           <w:tcPr>
-            <w:tcW w:type="dxa" w:w="2835"/>
-            <w:vAlign w:val="center"/>
-            <w:tcMar>
-              <w:top w:w="65" w:type="dxa"/>
-              <w:left w:w="65" w:type="dxa"/>
-              <w:bottom w:w="65" w:type="dxa"/>
-              <w:right w:w="65" w:type="dxa"/>
-            </w:tcMar>
-          </w:tcPr>
-          <w:p>
-            <w:pPr>
-              <w:spacing w:after="0"/>
-            </w:pPr>
-            <w:r>
-              <w:rPr>
-                <w:rFonts w:ascii="Times New Roman" w:hAnsi="Times New Roman"/>
-                <w:b w:val="0"/>
-                <w:sz w:val="20"/>
-              </w:rPr>
+            <w:tcW w:type="dxa" w:w="2592"/>
+            <w:vAlign w:val="center"/>
+            <w:tcMar>
+              <w:top w:w="65" w:type="dxa"/>
+              <w:left w:w="65" w:type="dxa"/>
+              <w:bottom w:w="65" w:type="dxa"/>
+              <w:right w:w="65" w:type="dxa"/>
+            </w:tcMar>
+          </w:tcPr>
+          <w:p>
+            <w:r>
               <w:t>Abhyuday Gupta</w:t>
             </w:r>
           </w:p>
         </w:tc>
         <w:tc>
           <w:tcPr>
-            <w:tcW w:type="dxa" w:w="6236"/>
-            <w:vAlign w:val="center"/>
-            <w:tcMar>
-              <w:top w:w="65" w:type="dxa"/>
-              <w:left w:w="65" w:type="dxa"/>
-              <w:bottom w:w="65" w:type="dxa"/>
-              <w:right w:w="65" w:type="dxa"/>
-            </w:tcMar>
-          </w:tcPr>
-          <w:p>
-            <w:pPr>
-              <w:spacing w:after="0"/>
-            </w:pPr>
-            <w:r>
-              <w:rPr>
-                <w:rFonts w:ascii="Times New Roman" w:hAnsi="Times New Roman"/>
-                <w:b w:val="0"/>
-                <w:sz w:val="20"/>
-              </w:rPr>
-              <w:t>Platform architecture, trusted build workflow, CLI, integration, and evidence review</w:t>
+            <w:tcW w:type="dxa" w:w="7776"/>
+            <w:vAlign w:val="center"/>
+            <w:tcMar>
+              <w:top w:w="65" w:type="dxa"/>
+              <w:left w:w="65" w:type="dxa"/>
+              <w:bottom w:w="65" w:type="dxa"/>
+              <w:right w:w="65" w:type="dxa"/>
+            </w:tcMar>
+          </w:tcPr>
+          <w:p>
+            <w:r>
+              <w:t>System architecture, trusted build workflow and CLI, cross-repository integration, and final evidence review</w:t>
             </w:r>
           </w:p>
         </w:tc>
@@ -5151,161 +4977,83 @@
         </w:trPr>
         <w:tc>
           <w:tcPr>
-            <w:tcW w:type="dxa" w:w="2835"/>
-            <w:vAlign w:val="center"/>
-            <w:tcMar>
-              <w:top w:w="65" w:type="dxa"/>
-              <w:left w:w="65" w:type="dxa"/>
-              <w:bottom w:w="65" w:type="dxa"/>
-              <w:right w:w="65" w:type="dxa"/>
-            </w:tcMar>
-          </w:tcPr>
-          <w:p>
-            <w:pPr>
-              <w:spacing w:after="0"/>
-            </w:pPr>
-            <w:r>
-              <w:rPr>
-                <w:rFonts w:ascii="Times New Roman" w:hAnsi="Times New Roman"/>
-                <w:b w:val="0"/>
-                <w:sz w:val="20"/>
-              </w:rPr>
+            <w:tcW w:type="dxa" w:w="2592"/>
+            <w:vAlign w:val="center"/>
+            <w:tcMar>
+              <w:top w:w="65" w:type="dxa"/>
+              <w:left w:w="65" w:type="dxa"/>
+              <w:bottom w:w="65" w:type="dxa"/>
+              <w:right w:w="65" w:type="dxa"/>
+            </w:tcMar>
+          </w:tcPr>
+          <w:p>
+            <w:r>
               <w:t>Aditya Chetan Thakur</w:t>
             </w:r>
           </w:p>
         </w:tc>
         <w:tc>
           <w:tcPr>
-            <w:tcW w:type="dxa" w:w="6236"/>
-            <w:vAlign w:val="center"/>
-            <w:tcMar>
-              <w:top w:w="65" w:type="dxa"/>
-              <w:left w:w="65" w:type="dxa"/>
-              <w:bottom w:w="65" w:type="dxa"/>
-              <w:right w:w="65" w:type="dxa"/>
-            </w:tcMar>
-          </w:tcPr>
-          <w:p>
-            <w:pPr>
-              <w:spacing w:after="0"/>
-            </w:pPr>
-            <w:r>
-              <w:rPr>
-                <w:rFonts w:ascii="Times New Roman" w:hAnsi="Times New Roman"/>
-                <w:b w:val="0"/>
-                <w:sz w:val="20"/>
-              </w:rPr>
-              <w:t>Infrastructure, managed database path, and Azure rebuild evaluation</w:t>
+            <w:tcW w:type="dxa" w:w="7776"/>
+            <w:vAlign w:val="center"/>
+            <w:tcMar>
+              <w:top w:w="65" w:type="dxa"/>
+              <w:left w:w="65" w:type="dxa"/>
+              <w:bottom w:w="65" w:type="dxa"/>
+              <w:right w:w="65" w:type="dxa"/>
+            </w:tcMar>
+          </w:tcPr>
+          <w:p>
+            <w:r>
+              <w:t>Azure and local infrastructure, Crossplane database path, and rebuild evaluation</w:t>
             </w:r>
           </w:p>
         </w:tc>
       </w:tr>
       <w:tr>
-        <w:trPr>
-          <w:cantSplit/>
-        </w:trPr>
-        <w:tc>
-          <w:tcPr>
-            <w:tcW w:type="dxa" w:w="2835"/>
-            <w:vAlign w:val="center"/>
-            <w:tcMar>
-              <w:top w:w="65" w:type="dxa"/>
-              <w:left w:w="65" w:type="dxa"/>
-              <w:bottom w:w="65" w:type="dxa"/>
-              <w:right w:w="65" w:type="dxa"/>
-            </w:tcMar>
-          </w:tcPr>
-          <w:p>
-            <w:pPr>
-              <w:spacing w:after="0"/>
-            </w:pPr>
-            <w:r>
-              <w:rPr>
-                <w:rFonts w:ascii="Times New Roman" w:hAnsi="Times New Roman"/>
-                <w:b w:val="0"/>
-                <w:sz w:val="20"/>
-              </w:rPr>
+        <w:tc>
+          <w:tcPr>
+            <w:tcW w:type="dxa" w:w="2592"/>
+            <w:vAlign w:val="center"/>
+          </w:tcPr>
+          <w:p>
+            <w:r>
               <w:t>Sankalp Arya</w:t>
             </w:r>
           </w:p>
         </w:tc>
         <w:tc>
           <w:tcPr>
-            <w:tcW w:type="dxa" w:w="6236"/>
-            <w:vAlign w:val="center"/>
-            <w:tcMar>
-              <w:top w:w="65" w:type="dxa"/>
-              <w:left w:w="65" w:type="dxa"/>
-              <w:bottom w:w="65" w:type="dxa"/>
-              <w:right w:w="65" w:type="dxa"/>
-            </w:tcMar>
-          </w:tcPr>
-          <w:p>
-            <w:pPr>
-              <w:spacing w:after="0"/>
-            </w:pPr>
-            <w:r>
-              <w:rPr>
-                <w:rFonts w:ascii="Times New Roman" w:hAnsi="Times New Roman"/>
-                <w:b w:val="0"/>
-                <w:sz w:val="20"/>
-              </w:rPr>
-              <w:t>Admission policies, threat model, and attack-suite evaluation</w:t>
+            <w:tcW w:type="dxa" w:w="7776"/>
+            <w:vAlign w:val="center"/>
+          </w:tcPr>
+          <w:p>
+            <w:r>
+              <w:t>Admission policy design and readiness, attack suite, threat model, and upstream policy reports</w:t>
             </w:r>
           </w:p>
         </w:tc>
       </w:tr>
       <w:tr>
-        <w:trPr>
-          <w:cantSplit/>
-        </w:trPr>
-        <w:tc>
-          <w:tcPr>
-            <w:tcW w:type="dxa" w:w="2835"/>
-            <w:vAlign w:val="center"/>
-            <w:tcMar>
-              <w:top w:w="65" w:type="dxa"/>
-              <w:left w:w="65" w:type="dxa"/>
-              <w:bottom w:w="65" w:type="dxa"/>
-              <w:right w:w="65" w:type="dxa"/>
-            </w:tcMar>
-          </w:tcPr>
-          <w:p>
-            <w:pPr>
-              <w:spacing w:after="0"/>
-            </w:pPr>
-            <w:r>
-              <w:rPr>
-                <w:rFonts w:ascii="Times New Roman" w:hAnsi="Times New Roman"/>
-                <w:b w:val="0"/>
-                <w:sz w:val="20"/>
-              </w:rPr>
+        <w:tc>
+          <w:tcPr>
+            <w:tcW w:type="dxa" w:w="2592"/>
+            <w:vAlign w:val="center"/>
+          </w:tcPr>
+          <w:p>
+            <w:r>
               <w:t>Shaurya Jain</w:t>
             </w:r>
           </w:p>
         </w:tc>
         <w:tc>
           <w:tcPr>
-            <w:tcW w:type="dxa" w:w="6236"/>
-            <w:vAlign w:val="center"/>
-            <w:tcMar>
-              <w:top w:w="65" w:type="dxa"/>
-              <w:left w:w="65" w:type="dxa"/>
-              <w:bottom w:w="65" w:type="dxa"/>
-              <w:right w:w="65" w:type="dxa"/>
-            </w:tcMar>
-          </w:tcPr>
-          <w:p>
-            <w:pPr>
-              <w:spacing w:after="0"/>
-            </w:pPr>
-            <w:r>
-              <w:rPr>
-                <w:rFonts w:ascii="Times New Roman" w:hAnsi="Times New Roman"/>
-                <w:b w:val="0"/>
-                <w:sz w:val="20"/>
-              </w:rPr>
-              <w:t>GitOps delivery, canary rollout, and observability evaluation</w:t>
+            <w:tcW w:type="dxa" w:w="7776"/>
+            <w:vAlign w:val="center"/>
+          </w:tcPr>
+          <w:p>
+            <w:r>
+              <w:t>GitOps delivery configuration, rollout and observability validation, and presentation/demo preparation</w:t>
             </w:r>
           </w:p>
         </w:tc>
@@ -5318,12 +5066,7 @@
         <w:jc w:val="center"/>
       </w:pPr>
       <w:r>
-        <w:rPr>
-          <w:b w:val="0"/>
-          <w:i/>
-          <w:sz w:val="18"/>
-        </w:rPr>
-        <w:t>Table 4.1. Planned work areas. Confirm the actual completed contributions with each member.</w:t>
+        <w:t>Table 4.1. Team contributions.</w:t>
       </w:r>
     </w:p>
     <w:p>

</xml_diff>

<commit_message>
docs: record live Azure database smoke test
</commit_message>
<xml_diff>
--- a/docs/report/Warden-Mini-Project-Report.docx
+++ b/docs/report/Warden-Mini-Project-Report.docx
@@ -1770,7 +1770,7 @@
         <w:jc w:val="both"/>
       </w:pPr>
       <w:r>
-        <w:t>We used AKS for managed Kubernetes; GitHub Actions for builds; GitHub Container Registry for immutable images; Microsoft Entra ID and GitHub OpenID Connect for workload identity; Sigstore for signing certificates and transparency entries; and Azure Storage for encrypted OpenTofu state. We used Argo CD for GitOps, Argo Rollouts for canaries, and Crossplane with CloudNativePG for databases. Together these services cover compute, registry, identity, storage, infrastructure as code, and delivery automation.</w:t>
+        <w:t>We used AKS for managed Kubernetes; GitHub Actions for builds; GitHub Container Registry for immutable images; Microsoft Entra ID and GitHub OpenID Connect for workload identity; Sigstore for signing certificates and transparency entries; and Azure Storage for encrypted OpenTofu state. We used Argo CD for GitOps, Argo Rollouts for canaries, and Crossplane with CloudNativePG and Azure Database for PostgreSQL Flexible Server for databases. The Azure smoke test provisioned PostgreSQL 18 and connected from AKS with the generated Secret. We have not yet run a service migration against this managed database.</w:t>
       </w:r>
     </w:p>
     <w:p>
@@ -1780,7 +1780,7 @@
         <w:jc w:val="both"/>
       </w:pPr>
       <w:r>
-        <w:t>We implemented enforceable digest, registry, and Pod-hygiene rules, a cryptographic policy tested in Audit, and self-service databases through CloudNativePG. Azure Flexible Server support is in open review PRs and still needs a live provisioning and lifecycle test. In Chapter 3, we distinguish controlled Deny-mode tests from installed enforcement. We did not evaluate production availability, multiple regions, or runtime intrusion detection.</w:t>
+        <w:t>We implemented enforceable digest, registry, and Pod-hygiene rules, a cryptographic policy tested in Audit, and self-service databases through Crossplane. The Azure Flexible Server composition ran in a live AKS smoke test; that test found three defects, now fixed in the current infrastructure working copy and awaiting review. In Chapter 3, we distinguish controlled Deny-mode tests from installed enforcement. We did not evaluate production availability, multiple regions, or runtime intrusion detection.</w:t>
       </w:r>
     </w:p>
     <w:p>
@@ -2516,7 +2516,7 @@
         <w:jc w:val="both"/>
       </w:pPr>
       <w:r>
-        <w:t>We expose a namespaced database request through Crossplane and CloudNativePG. The composition creates a predictable connection Secret, so an application manifest can remain the same across kind and AKS. We recorded database readiness and a client connection. We compute delivery metrics from deployment events rather than transient cluster logs, and retain attack outcomes, canary timing, rebuilds, and verification latency with their experiment records.</w:t>
+        <w:t>We expose a namespaced database request through Crossplane. Kind uses CloudNativePG; the Azure composition creates PostgreSQL Flexible Server, an app database, an AKS-egress firewall rule, and the &lt;name&gt;-conn Secret. A temporary in-cluster psql Pod connected with that Secret. We have not yet tested a service migration. We compute delivery metrics from deployment events rather than transient cluster logs, and retain attack outcomes, canary timing, rebuilds, and verification latency with their experiment records.</w:t>
       </w:r>
     </w:p>
     <w:p>
@@ -2992,7 +2992,7 @@
                 <w:b w:val="0"/>
                 <w:sz w:val="20"/>
               </w:rPr>
-              <w:t>Database ready: kind 804 s cold, 21 s warm; AKS 138 s</w:t>
+              <w:t>Kind: 804 s cold, 21 s warm; AKS/CNPG: 138 s; AKS/Flexible Server: SQL smoke test passed</w:t>
             </w:r>
           </w:p>
         </w:tc>
@@ -3017,7 +3017,7 @@
                 <w:b w:val="0"/>
                 <w:sz w:val="20"/>
               </w:rPr>
-              <w:t>Same request and Secret shape; both backed by CloudNativePG.</w:t>
+              <w:t>Flexible Server path provisioned and accepted SQL; service migration and benchmark remain open.</w:t>
             </w:r>
           </w:p>
         </w:tc>
@@ -4732,7 +4732,7 @@
         <w:jc w:val="both"/>
       </w:pPr>
       <w:r>
-        <w:t>Our measured database request worked in both environments and generated a usable connection URI; we used CloudNativePG on kind and AKS. Azure Flexible Server support is implemented in open infrastructure and GitOps pull requests but has not been merged or tested live. Our results establish portability of the request and Secret contract across clusters, not yet across database providers.</w:t>
+        <w:t>Database provisioning worked on both clusters. The earlier AKS readiness measurement used CloudNativePG (138 s); a separate Flexible Server smoke test created PostgreSQL 18 and verified SQL from an AKS Pod. The test covered database provisioning and connectivity, not a service migration. The Azure composition fixes found during the test still need review and merge.</w:t>
       </w:r>
     </w:p>
     <w:p>
@@ -4829,7 +4829,7 @@
         <w:jc w:val="both"/>
       </w:pPr>
       <w:r>
-        <w:t>We still need more work before claiming two promised outcomes are complete. Our installed cryptographic admission policy remains in Audit, even though a controlled Deny-mode suite passed. The Azure Flexible Server code is in review and still needs a live test. Our E1 sample is also smaller than planned. These limits separate features we tested from paths that are ready for production.</w:t>
+        <w:t>Two promised outcomes still need more work. Our installed cryptographic admission policy remains in Audit, even though a controlled Deny-mode suite passed. The Azure database smoke test did not exercise a service migration, and its composition fixes still need review and merge. Our E1 sample is also smaller than planned.</w:t>
       </w:r>
     </w:p>
     <w:p>
@@ -4839,7 +4839,7 @@
         <w:jc w:val="both"/>
       </w:pPr>
       <w:r>
-        <w:t>Our next steps are to remeasure image verification after a Kyverno fix, including legitimate Pods, registry failures, and timeout behavior before changing Audit to Deny; review and merge the Azure database changes, then test connection, deletion, and teardown; and expand our service-creation and canary measurements on AKS. We preserve the evidence for completed claims and identify the additional evidence these claims still need.</w:t>
+        <w:t>Our next steps are to remeasure image verification after a Kyverno fix, including legitimate Pods, registry failures, and timeout behavior before changing Audit to Deny; merge and repeat the Azure database test, then run a service migration; and expand our service-creation and canary measurements on AKS. We preserve the evidence for completed claims and identify the additional evidence these claims still need.</w:t>
       </w:r>
     </w:p>
     <w:p>

</xml_diff>

<commit_message>
Update demo runbook and Azure database evidence (#8)
* docs: refresh teacher demo runbook

* docs: annotate pre-existing cluster setup attempt

* docs: record live Azure database smoke test
</commit_message>
<xml_diff>
--- a/docs/report/Warden-Mini-Project-Report.docx
+++ b/docs/report/Warden-Mini-Project-Report.docx
@@ -1770,7 +1770,7 @@
         <w:jc w:val="both"/>
       </w:pPr>
       <w:r>
-        <w:t>We used AKS for managed Kubernetes; GitHub Actions for builds; GitHub Container Registry for immutable images; Microsoft Entra ID and GitHub OpenID Connect for workload identity; Sigstore for signing certificates and transparency entries; and Azure Storage for encrypted OpenTofu state. We used Argo CD for GitOps, Argo Rollouts for canaries, and Crossplane with CloudNativePG for databases. Together these services cover compute, registry, identity, storage, infrastructure as code, and delivery automation.</w:t>
+        <w:t>We used AKS for managed Kubernetes; GitHub Actions for builds; GitHub Container Registry for immutable images; Microsoft Entra ID and GitHub OpenID Connect for workload identity; Sigstore for signing certificates and transparency entries; and Azure Storage for encrypted OpenTofu state. We used Argo CD for GitOps, Argo Rollouts for canaries, and Crossplane with CloudNativePG and Azure Database for PostgreSQL Flexible Server for databases. The Azure smoke test provisioned PostgreSQL 18 and connected from AKS with the generated Secret. We have not yet run a service migration against this managed database.</w:t>
       </w:r>
     </w:p>
     <w:p>
@@ -1780,7 +1780,7 @@
         <w:jc w:val="both"/>
       </w:pPr>
       <w:r>
-        <w:t>We implemented enforceable digest, registry, and Pod-hygiene rules, a cryptographic policy tested in Audit, and self-service databases through CloudNativePG. Azure Flexible Server support is in open review PRs and still needs a live provisioning and lifecycle test. In Chapter 3, we distinguish controlled Deny-mode tests from installed enforcement. We did not evaluate production availability, multiple regions, or runtime intrusion detection.</w:t>
+        <w:t>We implemented enforceable digest, registry, and Pod-hygiene rules, a cryptographic policy tested in Audit, and self-service databases through Crossplane. The Azure Flexible Server composition ran in a live AKS smoke test; that test found three defects, now fixed in the current infrastructure working copy and awaiting review. In Chapter 3, we distinguish controlled Deny-mode tests from installed enforcement. We did not evaluate production availability, multiple regions, or runtime intrusion detection.</w:t>
       </w:r>
     </w:p>
     <w:p>
@@ -2516,7 +2516,7 @@
         <w:jc w:val="both"/>
       </w:pPr>
       <w:r>
-        <w:t>We expose a namespaced database request through Crossplane and CloudNativePG. The composition creates a predictable connection Secret, so an application manifest can remain the same across kind and AKS. We recorded database readiness and a client connection. We compute delivery metrics from deployment events rather than transient cluster logs, and retain attack outcomes, canary timing, rebuilds, and verification latency with their experiment records.</w:t>
+        <w:t>We expose a namespaced database request through Crossplane. Kind uses CloudNativePG; the Azure composition creates PostgreSQL Flexible Server, an app database, an AKS-egress firewall rule, and the &lt;name&gt;-conn Secret. A temporary in-cluster psql Pod connected with that Secret. We have not yet tested a service migration. We compute delivery metrics from deployment events rather than transient cluster logs, and retain attack outcomes, canary timing, rebuilds, and verification latency with their experiment records.</w:t>
       </w:r>
     </w:p>
     <w:p>
@@ -2992,7 +2992,7 @@
                 <w:b w:val="0"/>
                 <w:sz w:val="20"/>
               </w:rPr>
-              <w:t>Database ready: kind 804 s cold, 21 s warm; AKS 138 s</w:t>
+              <w:t>Kind: 804 s cold, 21 s warm; AKS/CNPG: 138 s; AKS/Flexible Server: SQL smoke test passed</w:t>
             </w:r>
           </w:p>
         </w:tc>
@@ -3017,7 +3017,7 @@
                 <w:b w:val="0"/>
                 <w:sz w:val="20"/>
               </w:rPr>
-              <w:t>Same request and Secret shape; both backed by CloudNativePG.</w:t>
+              <w:t>Flexible Server path provisioned and accepted SQL; service migration and benchmark remain open.</w:t>
             </w:r>
           </w:p>
         </w:tc>
@@ -4732,7 +4732,7 @@
         <w:jc w:val="both"/>
       </w:pPr>
       <w:r>
-        <w:t>Our measured database request worked in both environments and generated a usable connection URI; we used CloudNativePG on kind and AKS. Azure Flexible Server support is implemented in open infrastructure and GitOps pull requests but has not been merged or tested live. Our results establish portability of the request and Secret contract across clusters, not yet across database providers.</w:t>
+        <w:t>Database provisioning worked on both clusters. The earlier AKS readiness measurement used CloudNativePG (138 s); a separate Flexible Server smoke test created PostgreSQL 18 and verified SQL from an AKS Pod. The test covered database provisioning and connectivity, not a service migration. The Azure composition fixes found during the test still need review and merge.</w:t>
       </w:r>
     </w:p>
     <w:p>
@@ -4829,7 +4829,7 @@
         <w:jc w:val="both"/>
       </w:pPr>
       <w:r>
-        <w:t>We still need more work before claiming two promised outcomes are complete. Our installed cryptographic admission policy remains in Audit, even though a controlled Deny-mode suite passed. The Azure Flexible Server code is in review and still needs a live test. Our E1 sample is also smaller than planned. These limits separate features we tested from paths that are ready for production.</w:t>
+        <w:t>Two promised outcomes still need more work. Our installed cryptographic admission policy remains in Audit, even though a controlled Deny-mode suite passed. The Azure database smoke test did not exercise a service migration, and its composition fixes still need review and merge. Our E1 sample is also smaller than planned.</w:t>
       </w:r>
     </w:p>
     <w:p>
@@ -4839,7 +4839,7 @@
         <w:jc w:val="both"/>
       </w:pPr>
       <w:r>
-        <w:t>Our next steps are to remeasure image verification after a Kyverno fix, including legitimate Pods, registry failures, and timeout behavior before changing Audit to Deny; review and merge the Azure database changes, then test connection, deletion, and teardown; and expand our service-creation and canary measurements on AKS. We preserve the evidence for completed claims and identify the additional evidence these claims still need.</w:t>
+        <w:t>Our next steps are to remeasure image verification after a Kyverno fix, including legitimate Pods, registry failures, and timeout behavior before changing Audit to Deny; merge and repeat the Azure database test, then run a service migration; and expand our service-creation and canary measurements on AKS. We preserve the evidence for completed claims and identify the additional evidence these claims still need.</w:t>
       </w:r>
     </w:p>
     <w:p>

</xml_diff>